<commit_message>
docs: "working sessions" with the specialist, not "near-daily"
The trust brief, banner, §10 record, and CHANGELOG described the collaboration
with the file accessibility specialist as "near-daily"; the user prefers the
plainer "working sessions". Edited in place: none of these surfaces has been
deployed (production is on 1.115.0), so no published record is rewritten.
Version stays 1.118.0; brief regenerated so /trust.html and the emailable
twins stay byte-identical.
</commit_message>
<xml_diff>
--- a/docs/brief/checker-brief.docx
+++ b/docs/brief/checker-brief.docx
@@ -98,7 +98,7 @@
           <w:b/>
           <w:bCs/>
         </w:rPr>
-        <w:t xml:space="preserve">672</w:t>
+        <w:t xml:space="preserve">673</w:t>
       </w:r>
       <w:r>
         <w:t xml:space="preserve"> </w:t>
@@ -544,7 +544,7 @@
           <w:b/>
           <w:bCs/>
         </w:rPr>
-        <w:t xml:space="preserve">near-daily working sessions with ICJIA’s file accessibility specialist</w:t>
+        <w:t xml:space="preserve">working sessions with ICJIA’s file accessibility specialist</w:t>
       </w:r>
       <w:r>
         <w:t xml:space="preserve"> </w:t>
@@ -691,13 +691,13 @@
       </w:r>
     </w:p>
     <w:bookmarkEnd w:id="14"/>
-    <w:bookmarkStart w:id="15" w:name="six-months.-672-changes.-118-versions."/>
+    <w:bookmarkStart w:id="15" w:name="six-months.-673-changes.-118-versions."/>
     <w:p>
       <w:pPr>
         <w:pStyle w:val="Heading2"/>
       </w:pPr>
       <w:r>
-        <w:t xml:space="preserve">Six months. 672 changes. 118 versions.</w:t>
+        <w:t xml:space="preserve">Six months. 673 changes. 118 versions.</w:t>
       </w:r>
     </w:p>
     <w:p>
@@ -705,7 +705,7 @@
         <w:pStyle w:val="FirstParagraph"/>
       </w:pPr>
       <w:r>
-        <w:t xml:space="preserve">Not a weekend project. Since March it has grown from a single PDF check into a checker for four kinds of files — 232 saved changes in the last 30 days alone, its battery of self-checks grown from about 1,500 in June to 2,915 today. Milestones: adopted WCAG 2.2 AA — everything in the 2.1 version Title II and IITAA name, plus the newest requirements · removed all accounts and identity (nothing stored about who uses it) · covered all 31 industry checkpoints · lost two public arguments and fixed both · made its own grading</w:t>
+        <w:t xml:space="preserve">Not a weekend project. Since March it has grown from a single PDF check into a checker for four kinds of files — 233 saved changes in the last 30 days alone, its battery of self-checks grown from about 1,500 in June to 2,915 today. Milestones: adopted WCAG 2.2 AA — everything in the 2.1 version Title II and IITAA name, plus the newest requirements · removed all accounts and identity (nothing stored about who uses it) · covered all 31 industry checkpoints · lost two public arguments and fixed both · made its own grading</w:t>
       </w:r>
       <w:r>
         <w:t xml:space="preserve"> </w:t>

</xml_diff>

<commit_message>
docs: the feedback loop is internal AND external, with the live stats as proof
"Honed with the agency's own file accessibility specialist" became "Honed
with internal and external accessibility specialists": the checker is used
every day by ICJIA and by outside agencies and document specialists, and the
section now says so — with a link to the public stats page so the "every day"
is checkable, not claimed. Banner, §10 record, and CHANGELOG phrasing kept in
step (none deployed yet; production is on 1.115.0). Brief regenerated so
/trust.html and the emailable twins stay byte-identical.
</commit_message>
<xml_diff>
--- a/docs/brief/checker-brief.docx
+++ b/docs/brief/checker-brief.docx
@@ -98,7 +98,7 @@
           <w:b/>
           <w:bCs/>
         </w:rPr>
-        <w:t xml:space="preserve">673</w:t>
+        <w:t xml:space="preserve">674</w:t>
       </w:r>
       <w:r>
         <w:t xml:space="preserve"> </w:t>
@@ -520,13 +520,13 @@
       </w:r>
     </w:p>
     <w:bookmarkEnd w:id="13"/>
-    <w:bookmarkStart w:id="14" w:name="X5d91ec6eb0bf88b9c84e4848a192cd9104c75fa"/>
+    <w:bookmarkStart w:id="14" w:name="Xc6a005099c994168ac334e599e9423a139edf49"/>
     <w:p>
       <w:pPr>
         <w:pStyle w:val="Heading2"/>
       </w:pPr>
       <w:r>
-        <w:t xml:space="preserve">Honed with the agency’s own file accessibility specialist</w:t>
+        <w:t xml:space="preserve">Honed with internal and external accessibility specialists</w:t>
       </w:r>
     </w:p>
     <w:p>
@@ -534,23 +534,35 @@
         <w:pStyle w:val="FirstParagraph"/>
       </w:pPr>
       <w:r>
-        <w:t xml:space="preserve">The checker is tuned in</w:t>
-      </w:r>
-      <w:r>
-        <w:t xml:space="preserve"> </w:t>
-      </w:r>
-      <w:r>
-        <w:rPr>
-          <w:b/>
-          <w:bCs/>
-        </w:rPr>
-        <w:t xml:space="preserve">working sessions with ICJIA’s file accessibility specialist</w:t>
-      </w:r>
-      <w:r>
-        <w:t xml:space="preserve"> </w:t>
-      </w:r>
-      <w:r>
-        <w:t xml:space="preserve">in the Research &amp; Analysis unit — real documents, real disputes, fixes shipped the same day. Three grade challenges from document experts this week alone, each settled by</w:t>
+        <w:t xml:space="preserve">This is not an internal experiment. The checker is</w:t>
+      </w:r>
+      <w:r>
+        <w:t xml:space="preserve"> </w:t>
+      </w:r>
+      <w:r>
+        <w:rPr>
+          <w:b/>
+          <w:bCs/>
+        </w:rPr>
+        <w:t xml:space="preserve">used every day — by ICJIA and by outside agencies and document specialists</w:t>
+      </w:r>
+      <w:r>
+        <w:t xml:space="preserve"> </w:t>
+      </w:r>
+      <w:r>
+        <w:t xml:space="preserve">— and tuned in working sessions with accessibility specialists inside and outside the agency: real documents, real disputes, fixes shipped the same day. Don’t take the</w:t>
+      </w:r>
+      <w:r>
+        <w:t xml:space="preserve"> </w:t>
+      </w:r>
+      <w:r>
+        <w:t xml:space="preserve">“every day”</w:t>
+      </w:r>
+      <w:r>
+        <w:t xml:space="preserve"> </w:t>
+      </w:r>
+      <w:r>
+        <w:t xml:space="preserve">on faith: the public stats page (audit.icjia.app/status) counts every check-up as it happens. Three grade challenges from document experts this week alone, each settled by</w:t>
       </w:r>
       <w:r>
         <w:t xml:space="preserve"> </w:t>
@@ -691,13 +703,13 @@
       </w:r>
     </w:p>
     <w:bookmarkEnd w:id="14"/>
-    <w:bookmarkStart w:id="15" w:name="six-months.-673-changes.-118-versions."/>
+    <w:bookmarkStart w:id="15" w:name="six-months.-674-changes.-118-versions."/>
     <w:p>
       <w:pPr>
         <w:pStyle w:val="Heading2"/>
       </w:pPr>
       <w:r>
-        <w:t xml:space="preserve">Six months. 673 changes. 118 versions.</w:t>
+        <w:t xml:space="preserve">Six months. 674 changes. 118 versions.</w:t>
       </w:r>
     </w:p>
     <w:p>
@@ -705,7 +717,7 @@
         <w:pStyle w:val="FirstParagraph"/>
       </w:pPr>
       <w:r>
-        <w:t xml:space="preserve">Not a weekend project. Since March it has grown from a single PDF check into a checker for four kinds of files — 233 saved changes in the last 30 days alone, its battery of self-checks grown from about 1,500 in June to 2,915 today. Milestones: adopted WCAG 2.2 AA — everything in the 2.1 version Title II and IITAA name, plus the newest requirements · removed all accounts and identity (nothing stored about who uses it) · covered all 31 industry checkpoints · lost two public arguments and fixed both · made its own grading</w:t>
+        <w:t xml:space="preserve">Not a weekend project. Since March it has grown from a single PDF check into a checker for four kinds of files — 234 saved changes in the last 30 days alone, its battery of self-checks grown from about 1,500 in June to 2,915 today. Milestones: adopted WCAG 2.2 AA — everything in the 2.1 version Title II and IITAA name, plus the newest requirements · removed all accounts and identity (nothing stored about who uses it) · covered all 31 industry checkpoints · lost two public arguments and fixed both · made its own grading</w:t>
       </w:r>
       <w:r>
         <w:t xml:space="preserve"> </w:t>

</xml_diff>

<commit_message>
docs: the two verdict pills say what each verdict IS
The trust page's pipeline diagram ended in two bare pills — "Our verdict" /
"Their verdict" — and the page's owner had to ask what they meant, which is
the test failing in person. Each pill now carries its subtitle: ours is "the
0-100 score, the letter grade, and the fix-it list"; theirs is "veraPDF's
independent pass / fail against the PDF/UA rulebook". Template, in-app
styles, and the docx twin all updated; brief regenerated so every output
stays in sync. Version stays 1.119.0 (undeployed).
</commit_message>
<xml_diff>
--- a/docs/brief/checker-brief.docx
+++ b/docs/brief/checker-brief.docx
@@ -98,7 +98,7 @@
           <w:b/>
           <w:bCs/>
         </w:rPr>
-        <w:t xml:space="preserve">675</w:t>
+        <w:t xml:space="preserve">676</w:t>
       </w:r>
       <w:r>
         <w:t xml:space="preserve"> </w:t>
@@ -413,7 +413,7 @@
         <w:t xml:space="preserve">on every single report</w:t>
       </w:r>
       <w:r>
-        <w:t xml:space="preserve">, as an independent second opinion. If ours were wrong, theirs would say so — in public, on every audit. One precision the experts will appreciate:</w:t>
+        <w:t xml:space="preserve">, as an independent second opinion — so every report carries two verdicts: ours (the 0–100 score, the letter grade, and the fix-it list) and theirs (veraPDF’s independent pass/fail against the PDF/UA rulebook). If ours were wrong, theirs would say so — in public, on every audit. One precision the experts will appreciate:</w:t>
       </w:r>
       <w:r>
         <w:t xml:space="preserve"> </w:t>
@@ -703,13 +703,13 @@
       </w:r>
     </w:p>
     <w:bookmarkEnd w:id="14"/>
-    <w:bookmarkStart w:id="15" w:name="six-months.-675-changes.-119-versions."/>
+    <w:bookmarkStart w:id="15" w:name="six-months.-676-changes.-119-versions."/>
     <w:p>
       <w:pPr>
         <w:pStyle w:val="Heading2"/>
       </w:pPr>
       <w:r>
-        <w:t xml:space="preserve">Six months. 675 changes. 119 versions.</w:t>
+        <w:t xml:space="preserve">Six months. 676 changes. 119 versions.</w:t>
       </w:r>
     </w:p>
     <w:p>
@@ -717,7 +717,7 @@
         <w:pStyle w:val="FirstParagraph"/>
       </w:pPr>
       <w:r>
-        <w:t xml:space="preserve">Not a weekend project. Since March it has grown from a single PDF check into a checker for four kinds of files — 235 saved changes in the last 30 days alone, its battery of self-checks grown from about 1,500 in June to 2,922 today. Milestones, newest first: passes its own trap test 39/39 · fixed the outlier that wrongly refused a 246-page annual report — traced to the server, not the file, with proof · made its own grading</w:t>
+        <w:t xml:space="preserve">Not a weekend project. Since March it has grown from a single PDF check into a checker for four kinds of files — 236 saved changes in the last 30 days alone, its battery of self-checks grown from about 1,500 in June to 2,922 today. Milestones, newest first: passes its own trap test 39/39 · fixed the outlier that wrongly refused a 246-page annual report — traced to the server, not the file, with proof · made its own grading</w:t>
       </w:r>
       <w:r>
         <w:t xml:space="preserve"> </w:t>

</xml_diff>

<commit_message>
docs: "in one week alone" — the expert-challenge count no longer dates itself
"This week alone" goes stale the moment the week turns; "in one week
alone" states the same fact permanently.
</commit_message>
<xml_diff>
--- a/docs/brief/checker-brief.docx
+++ b/docs/brief/checker-brief.docx
@@ -56,7 +56,7 @@
         <w:t xml:space="preserve"> </w:t>
       </w:r>
       <w:r>
-        <w:t xml:space="preserve">check-ups run for internal and external agencies — the quick per-file check-up that has caught on beyond ICJIA: easier than SiteImprove, clearer than PAC. 8,162 in the last 30 days alone. ·</w:t>
+        <w:t xml:space="preserve">check-ups run for internal and external agencies — the quick per-file check-up that has caught on beyond ICJIA: easier than SiteImprove, clearer than PAC. 8,160 in the last 30 days alone. ·</w:t>
       </w:r>
       <w:r>
         <w:t xml:space="preserve"> </w:t>
@@ -98,7 +98,7 @@
           <w:b/>
           <w:bCs/>
         </w:rPr>
-        <w:t xml:space="preserve">677</w:t>
+        <w:t xml:space="preserve">678</w:t>
       </w:r>
       <w:r>
         <w:t xml:space="preserve"> </w:t>
@@ -644,7 +644,7 @@
         <w:t xml:space="preserve"> </w:t>
       </w:r>
       <w:r>
-        <w:t xml:space="preserve">on faith: the public stats page (audit.icjia.app/status) counts every check-up as it happens. Three grade challenges from document experts this week alone, each settled by</w:t>
+        <w:t xml:space="preserve">on faith: the public stats page (audit.icjia.app/status) counts every check-up as it happens. Three grade challenges from document experts in one week alone, each settled by</w:t>
       </w:r>
       <w:r>
         <w:t xml:space="preserve"> </w:t>
@@ -933,13 +933,13 @@
       </w:r>
     </w:p>
     <w:bookmarkEnd w:id="16"/>
-    <w:bookmarkStart w:id="19" w:name="six-months.-677-changes.-120-versions."/>
+    <w:bookmarkStart w:id="19" w:name="six-months.-678-changes.-120-versions."/>
     <w:p>
       <w:pPr>
         <w:pStyle w:val="Heading2"/>
       </w:pPr>
       <w:r>
-        <w:t xml:space="preserve">Six months. 677 changes. 120 versions.</w:t>
+        <w:t xml:space="preserve">Six months. 678 changes. 120 versions.</w:t>
       </w:r>
     </w:p>
     <w:p>
@@ -947,7 +947,7 @@
         <w:pStyle w:val="FirstParagraph"/>
       </w:pPr>
       <w:r>
-        <w:t xml:space="preserve">Not a weekend project. Since March it has grown from a single PDF check into a checker for four kinds of files — 237 saved changes in the last 30 days alone, its battery of self-checks grown from about 1,500 in June to 2,922 today. All of it is public, on GitHub:</w:t>
+        <w:t xml:space="preserve">Not a weekend project. Since March it has grown from a single PDF check into a checker for four kinds of files — 238 saved changes in the last 30 days alone, its battery of self-checks grown from about 1,500 in June to 2,922 today. All of it is public, on GitHub:</w:t>
       </w:r>
       <w:r>
         <w:t xml:space="preserve"> </w:t>

</xml_diff>

<commit_message>
release: v1.121.0 — every open Dependabot alert cleared
The dependency safety sweep, promoted to a proper release: puppeteer 25
(removes the unpatchable extract-zip advisory from the tree entirely),
@nuxt/ui 4.11 (patched line for the unused form-component advisory),
mermaid 11.17.2 (five dev-only advisories). Rode-along fixes: async
executablePath in the /status probe, literal rel type on the preconnect
hint, version-proof mermaid resolution in generate-diagrams.

Verified: 2,922 tests green; live render + axe pass on Chrome 152;
prod deployed and its chromium probe healthy; UI screenshots intact on
Nuxt UI 4.11; diagrams pixel-identical; fast-xml-parser unmoved so no
score can shift.

Versions ×6, CHANGELOG, README §Security, §10 entry. No banner —
nothing a visitor would see changed.
</commit_message>
<xml_diff>
--- a/docs/brief/checker-brief.docx
+++ b/docs/brief/checker-brief.docx
@@ -56,7 +56,7 @@
         <w:t xml:space="preserve"> </w:t>
       </w:r>
       <w:r>
-        <w:t xml:space="preserve">check-ups run for internal and external agencies — the quick per-file check-up that has caught on beyond ICJIA: easier than SiteImprove, clearer than PAC. 8,160 in the last 30 days alone. ·</w:t>
+        <w:t xml:space="preserve">check-ups run for internal and external agencies — the quick per-file check-up that has caught on beyond ICJIA: easier than SiteImprove, clearer than PAC. 8,159 in the last 30 days alone. ·</w:t>
       </w:r>
       <w:r>
         <w:t xml:space="preserve"> </w:t>
@@ -98,7 +98,7 @@
           <w:b/>
           <w:bCs/>
         </w:rPr>
-        <w:t xml:space="preserve">678</w:t>
+        <w:t xml:space="preserve">680</w:t>
       </w:r>
       <w:r>
         <w:t xml:space="preserve"> </w:t>
@@ -933,13 +933,13 @@
       </w:r>
     </w:p>
     <w:bookmarkEnd w:id="16"/>
-    <w:bookmarkStart w:id="19" w:name="six-months.-678-changes.-120-versions."/>
+    <w:bookmarkStart w:id="19" w:name="six-months.-680-changes.-121-versions."/>
     <w:p>
       <w:pPr>
         <w:pStyle w:val="Heading2"/>
       </w:pPr>
       <w:r>
-        <w:t xml:space="preserve">Six months. 678 changes. 120 versions.</w:t>
+        <w:t xml:space="preserve">Six months. 680 changes. 121 versions.</w:t>
       </w:r>
     </w:p>
     <w:p>
@@ -947,7 +947,7 @@
         <w:pStyle w:val="FirstParagraph"/>
       </w:pPr>
       <w:r>
-        <w:t xml:space="preserve">Not a weekend project. Since March it has grown from a single PDF check into a checker for four kinds of files — 238 saved changes in the last 30 days alone, its battery of self-checks grown from about 1,500 in June to 2,922 today. All of it is public, on GitHub:</w:t>
+        <w:t xml:space="preserve">Not a weekend project. Since March it has grown from a single PDF check into a checker for four kinds of files — 240 saved changes in the last 30 days alone, its battery of self-checks grown from about 1,500 in June to 2,922 today. All of it is public, on GitHub:</w:t>
       </w:r>
       <w:r>
         <w:t xml:space="preserve"> </w:t>
@@ -1100,7 +1100,7 @@
         <w:t xml:space="preserve"> </w:t>
       </w:r>
       <w:r>
-        <w:t xml:space="preserve">120 version notes plus a plain-language security log written for records auditors — mistakes included.</w:t>
+        <w:t xml:space="preserve">121 version notes plus a plain-language security log written for records auditors — mistakes included.</w:t>
       </w:r>
     </w:p>
     <w:p>

</xml_diff>

<commit_message>
branding: ICJIA Accessibility Audit — plus the modal deep-link and a Close you can't miss
- App name: 'Accessibility Audit' → 'ICJIA Accessibility Audit'
  (BRANDING.APP_SHORT_NAME; flows to the header, browser title, og
  meta). site.webmanifest short_name, printablePlan fallback, and the
  test-helpers mock updated to match. The OG image gains a teal ICJIA
  eyebrow above the title (og-image.svg + regenerated png via sharp).
- The What's New 'See all 100 trap documents' link now opens the modal
  itself: linkTo /trust#all-traps with linkExternal on purpose — the
  modal opens via CSS :target, which only re-evaluates on a real hash
  navigation; the router's pushState does not reliably trigger it.
- The modal's Close is now a solid green pill reading 'Close — back to
  the page' — obvious as the way back (brief template + .trust-page
  twin).
- Trust brief grammar: 'Inside it run qpdf…' → 'Inside it runs qpdf…'
  (html + md, user request).
</commit_message>
<xml_diff>
--- a/docs/brief/checker-brief.docx
+++ b/docs/brief/checker-brief.docx
@@ -98,7 +98,7 @@
           <w:b/>
           <w:bCs/>
         </w:rPr>
-        <w:t xml:space="preserve">681</w:t>
+        <w:t xml:space="preserve">682</w:t>
       </w:r>
       <w:r>
         <w:t xml:space="preserve"> </w:t>
@@ -960,13 +960,13 @@
       </w:r>
     </w:p>
     <w:bookmarkEnd w:id="16"/>
-    <w:bookmarkStart w:id="19" w:name="six-months.-681-changes.-122-versions."/>
+    <w:bookmarkStart w:id="19" w:name="six-months.-682-changes.-122-versions."/>
     <w:p>
       <w:pPr>
         <w:pStyle w:val="Heading2"/>
       </w:pPr>
       <w:r>
-        <w:t xml:space="preserve">Six months. 681 changes. 122 versions.</w:t>
+        <w:t xml:space="preserve">Six months. 682 changes. 122 versions.</w:t>
       </w:r>
     </w:p>
     <w:p>
@@ -974,7 +974,7 @@
         <w:pStyle w:val="FirstParagraph"/>
       </w:pPr>
       <w:r>
-        <w:t xml:space="preserve">Not a weekend project. Since March it has grown from a single PDF check into a checker for four kinds of files — 241 saved changes in the last 30 days alone, its battery of self-checks grown from about 1,500 in June to 2,923 today. All of it is public, on GitHub:</w:t>
+        <w:t xml:space="preserve">Not a weekend project. Since March it has grown from a single PDF check into a checker for four kinds of files — 242 saved changes in the last 30 days alone, its battery of self-checks grown from about 1,500 in June to 2,923 today. All of it is public, on GitHub:</w:t>
       </w:r>
       <w:r>
         <w:t xml:space="preserve"> </w:t>
@@ -1149,7 +1149,7 @@
         <w:t xml:space="preserve"> </w:t>
       </w:r>
       <w:r>
-        <w:t xml:space="preserve">Inside it run qpdf, veraPDF, and the Matterhorn Protocol — the same open tools and test model used every day by professional remediators and certified accessibility specialists worldwide. One person assembled them; the world builds and checks them.</w:t>
+        <w:t xml:space="preserve">Inside it runs qpdf, veraPDF, and the Matterhorn Protocol — the same open tools and test model used every day by professional remediators and certified accessibility specialists worldwide. One person assembled them; the world builds and checks them.</w:t>
       </w:r>
     </w:p>
     <w:p>

</xml_diff>

<commit_message>
copy: "Check it yourself." — and FAQs signals its new tab
- The trust hero closes the thought: "Do not trust the person who
  built it. Check it yourself." (brief html + md, /trust body via
  build-brief).
- The FAQs nav link now carries the same external-link glyph the
  footer uses, with an sr-only "(opens in a new tab)" for screen
  readers — the one nav item that leaves the site now says so.
</commit_message>
<xml_diff>
--- a/docs/brief/checker-brief.docx
+++ b/docs/brief/checker-brief.docx
@@ -2,13 +2,13 @@
 <file path=word/document.xml><?xml version="1.0" encoding="utf-8"?>
 <w:document xmlns:w="http://schemas.openxmlformats.org/wordprocessingml/2006/main" xmlns:m="http://schemas.openxmlformats.org/officeDocument/2006/math" xmlns:r="http://schemas.openxmlformats.org/officeDocument/2006/relationships" xmlns:o="urn:schemas-microsoft-com:office:office" xmlns:v="urn:schemas-microsoft-com:vml" xmlns:w10="urn:schemas-microsoft-com:office:word" xmlns:a="http://schemas.openxmlformats.org/drawingml/2006/main" xmlns:pic="http://schemas.openxmlformats.org/drawingml/2006/picture" xmlns:wp="http://schemas.openxmlformats.org/drawingml/2006/wordprocessingDrawing">
   <w:body>
-    <w:bookmarkStart w:id="22" w:name="X7a22338d2b18d06935514e1884309842e852ad6"/>
+    <w:bookmarkStart w:id="22" w:name="Xbbba7d4b807ed2db8b46be233cb715d08c14d1f"/>
     <w:p>
       <w:pPr>
         <w:pStyle w:val="Heading1"/>
       </w:pPr>
       <w:r>
-        <w:t xml:space="preserve">Don’t trust the person who built it. Check it.</w:t>
+        <w:t xml:space="preserve">Don’t trust the person who built it. Check it yourself.</w:t>
       </w:r>
     </w:p>
     <w:p>
@@ -98,7 +98,7 @@
           <w:b/>
           <w:bCs/>
         </w:rPr>
-        <w:t xml:space="preserve">683</w:t>
+        <w:t xml:space="preserve">684</w:t>
       </w:r>
       <w:r>
         <w:t xml:space="preserve"> </w:t>
@@ -960,13 +960,13 @@
       </w:r>
     </w:p>
     <w:bookmarkEnd w:id="16"/>
-    <w:bookmarkStart w:id="19" w:name="six-months.-683-changes.-122-versions."/>
+    <w:bookmarkStart w:id="19" w:name="six-months.-684-changes.-122-versions."/>
     <w:p>
       <w:pPr>
         <w:pStyle w:val="Heading2"/>
       </w:pPr>
       <w:r>
-        <w:t xml:space="preserve">Six months. 683 changes. 122 versions.</w:t>
+        <w:t xml:space="preserve">Six months. 684 changes. 122 versions.</w:t>
       </w:r>
     </w:p>
     <w:p>
@@ -974,7 +974,7 @@
         <w:pStyle w:val="FirstParagraph"/>
       </w:pPr>
       <w:r>
-        <w:t xml:space="preserve">Not a weekend project. Since March it has grown from a single PDF check into a checker for four kinds of files — 243 saved changes in the last 30 days alone, its battery of self-checks grown from about 1,500 in June to 2,924 today. All of it is public, on GitHub:</w:t>
+        <w:t xml:space="preserve">Not a weekend project. Since March it has grown from a single PDF check into a checker for four kinds of files — 244 saved changes in the last 30 days alone, its battery of self-checks grown from about 1,500 in June to 2,924 today. All of it is public, on GitHub:</w:t>
       </w:r>
       <w:r>
         <w:t xml:space="preserve"> </w:t>

</xml_diff>

<commit_message>
copy: the objection speaks its whole mind — and gets conceded
"But... but one person built it. It's not Google or Microsoft.
It's just a developer at an Illinois agency. The developer is not
even on executive staff!"

Answered: "True — every word of it. Which is exactly why nothing here
asks for trust: every claim below is checkable by anyone." The
concession IS the argument — the check cards do the rest. (Also
aligned the docx twin's lede, which had kept the original wording
when an earlier batch died mid-script.)
</commit_message>
<xml_diff>
--- a/docs/brief/checker-brief.docx
+++ b/docs/brief/checker-brief.docx
@@ -98,7 +98,7 @@
           <w:b/>
           <w:bCs/>
         </w:rPr>
-        <w:t xml:space="preserve">684</w:t>
+        <w:t xml:space="preserve">685</w:t>
       </w:r>
       <w:r>
         <w:t xml:space="preserve"> </w:t>
@@ -960,13 +960,13 @@
       </w:r>
     </w:p>
     <w:bookmarkEnd w:id="16"/>
-    <w:bookmarkStart w:id="19" w:name="six-months.-684-changes.-122-versions."/>
+    <w:bookmarkStart w:id="19" w:name="six-months.-685-changes.-122-versions."/>
     <w:p>
       <w:pPr>
         <w:pStyle w:val="Heading2"/>
       </w:pPr>
       <w:r>
-        <w:t xml:space="preserve">Six months. 684 changes. 122 versions.</w:t>
+        <w:t xml:space="preserve">Six months. 685 changes. 122 versions.</w:t>
       </w:r>
     </w:p>
     <w:p>
@@ -974,7 +974,7 @@
         <w:pStyle w:val="FirstParagraph"/>
       </w:pPr>
       <w:r>
-        <w:t xml:space="preserve">Not a weekend project. Since March it has grown from a single PDF check into a checker for four kinds of files — 244 saved changes in the last 30 days alone, its battery of self-checks grown from about 1,500 in June to 2,924 today. All of it is public, on GitHub:</w:t>
+        <w:t xml:space="preserve">Not a weekend project. Since March it has grown from a single PDF check into a checker for four kinds of files — 245 saved changes in the last 30 days alone, its battery of self-checks grown from about 1,500 in June to 2,924 today. All of it is public, on GitHub:</w:t>
       </w:r>
       <w:r>
         <w:t xml:space="preserve"> </w:t>
@@ -1025,13 +1025,13 @@
       </w:r>
     </w:p>
     <w:bookmarkEnd w:id="19"/>
-    <w:bookmarkStart w:id="20" w:name="but-one-person-built-it."/>
+    <w:bookmarkStart w:id="20" w:name="Xff0d522d9801aa20ea01122afd840b5ef6a26be"/>
     <w:p>
       <w:pPr>
         <w:pStyle w:val="Heading2"/>
       </w:pPr>
       <w:r>
-        <w:t xml:space="preserve">“But one person built it.”</w:t>
+        <w:t xml:space="preserve">“But… but one person built it. It’s not Google or Microsoft. It’s just a developer at an Illinois agency. The developer is not even on executive staff!”</w:t>
       </w:r>
     </w:p>
     <w:p>
@@ -1039,7 +1039,17 @@
         <w:pStyle w:val="FirstParagraph"/>
       </w:pPr>
       <w:r>
-        <w:t xml:space="preserve">Fair. So ignore the person entirely — every claim here is checkable by anyone:</w:t>
+        <w:rPr>
+          <w:b/>
+          <w:bCs/>
+        </w:rPr>
+        <w:t xml:space="preserve">True — every word of it.</w:t>
+      </w:r>
+      <w:r>
+        <w:t xml:space="preserve"> </w:t>
+      </w:r>
+      <w:r>
+        <w:t xml:space="preserve">Which is exactly why nothing here asks for trust: every claim here is checkable by anyone:</w:t>
       </w:r>
     </w:p>
     <w:p>

</xml_diff>

<commit_message>
copy: "a tiny Illinois agency" — and the objection quote gets breathing room
The four-line objection heading ran at the display line-height (1.05,
tuned for the two-line hero); it now has its own .objection-h at 1.22
(template + .trust-page twin). And the skeptic downgrades the shop
once more: "a developer at a tiny Illinois agency."
</commit_message>
<xml_diff>
--- a/docs/brief/checker-brief.docx
+++ b/docs/brief/checker-brief.docx
@@ -98,7 +98,7 @@
           <w:b/>
           <w:bCs/>
         </w:rPr>
-        <w:t xml:space="preserve">685</w:t>
+        <w:t xml:space="preserve">686</w:t>
       </w:r>
       <w:r>
         <w:t xml:space="preserve"> </w:t>
@@ -960,13 +960,13 @@
       </w:r>
     </w:p>
     <w:bookmarkEnd w:id="16"/>
-    <w:bookmarkStart w:id="19" w:name="six-months.-685-changes.-122-versions."/>
+    <w:bookmarkStart w:id="19" w:name="six-months.-686-changes.-122-versions."/>
     <w:p>
       <w:pPr>
         <w:pStyle w:val="Heading2"/>
       </w:pPr>
       <w:r>
-        <w:t xml:space="preserve">Six months. 685 changes. 122 versions.</w:t>
+        <w:t xml:space="preserve">Six months. 686 changes. 122 versions.</w:t>
       </w:r>
     </w:p>
     <w:p>
@@ -974,7 +974,7 @@
         <w:pStyle w:val="FirstParagraph"/>
       </w:pPr>
       <w:r>
-        <w:t xml:space="preserve">Not a weekend project. Since March it has grown from a single PDF check into a checker for four kinds of files — 245 saved changes in the last 30 days alone, its battery of self-checks grown from about 1,500 in June to 2,924 today. All of it is public, on GitHub:</w:t>
+        <w:t xml:space="preserve">Not a weekend project. Since March it has grown from a single PDF check into a checker for four kinds of files — 246 saved changes in the last 30 days alone, its battery of self-checks grown from about 1,500 in June to 2,924 today. All of it is public, on GitHub:</w:t>
       </w:r>
       <w:r>
         <w:t xml:space="preserve"> </w:t>
@@ -1025,13 +1025,13 @@
       </w:r>
     </w:p>
     <w:bookmarkEnd w:id="19"/>
-    <w:bookmarkStart w:id="20" w:name="Xff0d522d9801aa20ea01122afd840b5ef6a26be"/>
+    <w:bookmarkStart w:id="20" w:name="Xf238e70f859a8ed64a3ccafbb34f42d5dddb564"/>
     <w:p>
       <w:pPr>
         <w:pStyle w:val="Heading2"/>
       </w:pPr>
       <w:r>
-        <w:t xml:space="preserve">“But… but one person built it. It’s not Google or Microsoft. It’s just a developer at an Illinois agency. The developer is not even on executive staff!”</w:t>
+        <w:t xml:space="preserve">“But… but one person built it. It’s not Google or Microsoft. It’s just a developer at a tiny Illinois agency. The developer is not even on executive staff!”</w:t>
       </w:r>
     </w:p>
     <w:p>

</xml_diff>

<commit_message>
copy: the objection gets its weary closer
"...The developer is not even on executive staff! They've been here
forever. Why are we even looking at this?" — they/them per the
project's no-gender rule (confirmed), and the concession "True —
every word of it" now lands on all five sentences.
</commit_message>
<xml_diff>
--- a/docs/brief/checker-brief.docx
+++ b/docs/brief/checker-brief.docx
@@ -98,7 +98,7 @@
           <w:b/>
           <w:bCs/>
         </w:rPr>
-        <w:t xml:space="preserve">686</w:t>
+        <w:t xml:space="preserve">687</w:t>
       </w:r>
       <w:r>
         <w:t xml:space="preserve"> </w:t>
@@ -960,13 +960,13 @@
       </w:r>
     </w:p>
     <w:bookmarkEnd w:id="16"/>
-    <w:bookmarkStart w:id="19" w:name="six-months.-686-changes.-122-versions."/>
+    <w:bookmarkStart w:id="19" w:name="six-months.-687-changes.-122-versions."/>
     <w:p>
       <w:pPr>
         <w:pStyle w:val="Heading2"/>
       </w:pPr>
       <w:r>
-        <w:t xml:space="preserve">Six months. 686 changes. 122 versions.</w:t>
+        <w:t xml:space="preserve">Six months. 687 changes. 122 versions.</w:t>
       </w:r>
     </w:p>
     <w:p>
@@ -974,7 +974,7 @@
         <w:pStyle w:val="FirstParagraph"/>
       </w:pPr>
       <w:r>
-        <w:t xml:space="preserve">Not a weekend project. Since March it has grown from a single PDF check into a checker for four kinds of files — 246 saved changes in the last 30 days alone, its battery of self-checks grown from about 1,500 in June to 2,924 today. All of it is public, on GitHub:</w:t>
+        <w:t xml:space="preserve">Not a weekend project. Since March it has grown from a single PDF check into a checker for four kinds of files — 247 saved changes in the last 30 days alone, its battery of self-checks grown from about 1,500 in June to 2,924 today. All of it is public, on GitHub:</w:t>
       </w:r>
       <w:r>
         <w:t xml:space="preserve"> </w:t>
@@ -1025,13 +1025,13 @@
       </w:r>
     </w:p>
     <w:bookmarkEnd w:id="19"/>
-    <w:bookmarkStart w:id="20" w:name="Xf238e70f859a8ed64a3ccafbb34f42d5dddb564"/>
+    <w:bookmarkStart w:id="20" w:name="X0f06772433647f41140bc9fc957c002c2d2b1e0"/>
     <w:p>
       <w:pPr>
         <w:pStyle w:val="Heading2"/>
       </w:pPr>
       <w:r>
-        <w:t xml:space="preserve">“But… but one person built it. It’s not Google or Microsoft. It’s just a developer at a tiny Illinois agency. The developer is not even on executive staff!”</w:t>
+        <w:t xml:space="preserve">“But… but one person built it. It’s not Google or Microsoft. It’s just a developer at a tiny Illinois agency. The developer is not even on executive staff! They’ve been here forever. Why are we even looking at this?”</w:t>
       </w:r>
     </w:p>
     <w:p>

</xml_diff>

<commit_message>
copy: "one person built this" in the objection quote
</commit_message>
<xml_diff>
--- a/docs/brief/checker-brief.docx
+++ b/docs/brief/checker-brief.docx
@@ -98,7 +98,7 @@
           <w:b/>
           <w:bCs/>
         </w:rPr>
-        <w:t xml:space="preserve">687</w:t>
+        <w:t xml:space="preserve">688</w:t>
       </w:r>
       <w:r>
         <w:t xml:space="preserve"> </w:t>
@@ -960,13 +960,13 @@
       </w:r>
     </w:p>
     <w:bookmarkEnd w:id="16"/>
-    <w:bookmarkStart w:id="19" w:name="six-months.-687-changes.-122-versions."/>
+    <w:bookmarkStart w:id="19" w:name="six-months.-688-changes.-122-versions."/>
     <w:p>
       <w:pPr>
         <w:pStyle w:val="Heading2"/>
       </w:pPr>
       <w:r>
-        <w:t xml:space="preserve">Six months. 687 changes. 122 versions.</w:t>
+        <w:t xml:space="preserve">Six months. 688 changes. 122 versions.</w:t>
       </w:r>
     </w:p>
     <w:p>
@@ -974,7 +974,7 @@
         <w:pStyle w:val="FirstParagraph"/>
       </w:pPr>
       <w:r>
-        <w:t xml:space="preserve">Not a weekend project. Since March it has grown from a single PDF check into a checker for four kinds of files — 247 saved changes in the last 30 days alone, its battery of self-checks grown from about 1,500 in June to 2,924 today. All of it is public, on GitHub:</w:t>
+        <w:t xml:space="preserve">Not a weekend project. Since March it has grown from a single PDF check into a checker for four kinds of files — 248 saved changes in the last 30 days alone, its battery of self-checks grown from about 1,500 in June to 2,924 today. All of it is public, on GitHub:</w:t>
       </w:r>
       <w:r>
         <w:t xml:space="preserve"> </w:t>
@@ -1025,13 +1025,13 @@
       </w:r>
     </w:p>
     <w:bookmarkEnd w:id="19"/>
-    <w:bookmarkStart w:id="20" w:name="X0f06772433647f41140bc9fc957c002c2d2b1e0"/>
+    <w:bookmarkStart w:id="20" w:name="Xf60c07c13a52314bef063236a1d74e5a6a4c15c"/>
     <w:p>
       <w:pPr>
         <w:pStyle w:val="Heading2"/>
       </w:pPr>
       <w:r>
-        <w:t xml:space="preserve">“But… but one person built it. It’s not Google or Microsoft. It’s just a developer at a tiny Illinois agency. The developer is not even on executive staff! They’ve been here forever. Why are we even looking at this?”</w:t>
+        <w:t xml:space="preserve">“But… but one person built this. It’s not Google or Microsoft. It’s just a developer at a tiny Illinois agency. The developer is not even on executive staff! They’ve been here forever. Why are we even looking at this?”</w:t>
       </w:r>
     </w:p>
     <w:p>

</xml_diff>

<commit_message>
copy: "not Google or Microsoft or Adobe" in the objection quote
</commit_message>
<xml_diff>
--- a/docs/brief/checker-brief.docx
+++ b/docs/brief/checker-brief.docx
@@ -98,7 +98,7 @@
           <w:b/>
           <w:bCs/>
         </w:rPr>
-        <w:t xml:space="preserve">688</w:t>
+        <w:t xml:space="preserve">689</w:t>
       </w:r>
       <w:r>
         <w:t xml:space="preserve"> </w:t>
@@ -960,13 +960,13 @@
       </w:r>
     </w:p>
     <w:bookmarkEnd w:id="16"/>
-    <w:bookmarkStart w:id="19" w:name="six-months.-688-changes.-122-versions."/>
+    <w:bookmarkStart w:id="19" w:name="six-months.-689-changes.-122-versions."/>
     <w:p>
       <w:pPr>
         <w:pStyle w:val="Heading2"/>
       </w:pPr>
       <w:r>
-        <w:t xml:space="preserve">Six months. 688 changes. 122 versions.</w:t>
+        <w:t xml:space="preserve">Six months. 689 changes. 122 versions.</w:t>
       </w:r>
     </w:p>
     <w:p>
@@ -974,7 +974,7 @@
         <w:pStyle w:val="FirstParagraph"/>
       </w:pPr>
       <w:r>
-        <w:t xml:space="preserve">Not a weekend project. Since March it has grown from a single PDF check into a checker for four kinds of files — 248 saved changes in the last 30 days alone, its battery of self-checks grown from about 1,500 in June to 2,924 today. All of it is public, on GitHub:</w:t>
+        <w:t xml:space="preserve">Not a weekend project. Since March it has grown from a single PDF check into a checker for four kinds of files — 249 saved changes in the last 30 days alone, its battery of self-checks grown from about 1,500 in June to 2,924 today. All of it is public, on GitHub:</w:t>
       </w:r>
       <w:r>
         <w:t xml:space="preserve"> </w:t>
@@ -1025,13 +1025,13 @@
       </w:r>
     </w:p>
     <w:bookmarkEnd w:id="19"/>
-    <w:bookmarkStart w:id="20" w:name="Xf60c07c13a52314bef063236a1d74e5a6a4c15c"/>
+    <w:bookmarkStart w:id="20" w:name="X7b164af55eff670ea7aac602b63e24effe84421"/>
     <w:p>
       <w:pPr>
         <w:pStyle w:val="Heading2"/>
       </w:pPr>
       <w:r>
-        <w:t xml:space="preserve">“But… but one person built this. It’s not Google or Microsoft. It’s just a developer at a tiny Illinois agency. The developer is not even on executive staff! They’ve been here forever. Why are we even looking at this?”</w:t>
+        <w:t xml:space="preserve">“But… but one person built this. It’s not Google or Microsoft or Adobe. It’s just a developer at a tiny Illinois agency. The developer is not even on executive staff! They’ve been here forever. Why are we even looking at this?”</w:t>
       </w:r>
     </w:p>
     <w:p>

</xml_diff>

<commit_message>
copy: the objection lands on "buy real software" — and gets the battle-tested answer
Final quote: "But... but one person built this. It's not Google or
Microsoft or Adobe. The developer is not on executive staff. They've
been here at ICJIA forever. Why are we even looking at this? Let's
just buy real software."

Answer: "True — every word, right up until 'real software.'" This
is real software, battle-tested — live counts filled in for check-ups
and trap documents, the referee, the public record — and it is free.
(Dropped the tiny-agency sentence; softened the executive-staff line
per request.)
</commit_message>
<xml_diff>
--- a/docs/brief/checker-brief.docx
+++ b/docs/brief/checker-brief.docx
@@ -98,7 +98,7 @@
           <w:b/>
           <w:bCs/>
         </w:rPr>
-        <w:t xml:space="preserve">689</w:t>
+        <w:t xml:space="preserve">690</w:t>
       </w:r>
       <w:r>
         <w:t xml:space="preserve"> </w:t>
@@ -960,13 +960,13 @@
       </w:r>
     </w:p>
     <w:bookmarkEnd w:id="16"/>
-    <w:bookmarkStart w:id="19" w:name="six-months.-689-changes.-122-versions."/>
+    <w:bookmarkStart w:id="19" w:name="six-months.-690-changes.-122-versions."/>
     <w:p>
       <w:pPr>
         <w:pStyle w:val="Heading2"/>
       </w:pPr>
       <w:r>
-        <w:t xml:space="preserve">Six months. 689 changes. 122 versions.</w:t>
+        <w:t xml:space="preserve">Six months. 690 changes. 122 versions.</w:t>
       </w:r>
     </w:p>
     <w:p>
@@ -974,7 +974,7 @@
         <w:pStyle w:val="FirstParagraph"/>
       </w:pPr>
       <w:r>
-        <w:t xml:space="preserve">Not a weekend project. Since March it has grown from a single PDF check into a checker for four kinds of files — 249 saved changes in the last 30 days alone, its battery of self-checks grown from about 1,500 in June to 2,924 today. All of it is public, on GitHub:</w:t>
+        <w:t xml:space="preserve">Not a weekend project. Since March it has grown from a single PDF check into a checker for four kinds of files — 250 saved changes in the last 30 days alone, its battery of self-checks grown from about 1,500 in June to 2,924 today. All of it is public, on GitHub:</w:t>
       </w:r>
       <w:r>
         <w:t xml:space="preserve"> </w:t>
@@ -1025,13 +1025,13 @@
       </w:r>
     </w:p>
     <w:bookmarkEnd w:id="19"/>
-    <w:bookmarkStart w:id="20" w:name="X7b164af55eff670ea7aac602b63e24effe84421"/>
+    <w:bookmarkStart w:id="20" w:name="X3db6ff76fb4629a3eb8cdd4d7fcfc27df0dce42"/>
     <w:p>
       <w:pPr>
         <w:pStyle w:val="Heading2"/>
       </w:pPr>
       <w:r>
-        <w:t xml:space="preserve">“But… but one person built this. It’s not Google or Microsoft or Adobe. It’s just a developer at a tiny Illinois agency. The developer is not even on executive staff! They’ve been here forever. Why are we even looking at this?”</w:t>
+        <w:t xml:space="preserve">“But… but one person built this. It’s not Google or Microsoft or Adobe. The developer is not on executive staff. They’ve been here at ICJIA forever. Why are we even looking at this? Let’s just buy real software.”</w:t>
       </w:r>
     </w:p>
     <w:p>
@@ -1043,13 +1043,27 @@
           <w:b/>
           <w:bCs/>
         </w:rPr>
-        <w:t xml:space="preserve">True — every word of it.</w:t>
-      </w:r>
-      <w:r>
-        <w:t xml:space="preserve"> </w:t>
-      </w:r>
-      <w:r>
-        <w:t xml:space="preserve">Which is exactly why nothing here asks for trust: every claim here is checkable by anyone:</w:t>
+        <w:t xml:space="preserve">True — every word, right up until</w:t>
+      </w:r>
+      <w:r>
+        <w:rPr>
+          <w:b/>
+          <w:bCs/>
+        </w:rPr>
+        <w:t xml:space="preserve"> </w:t>
+      </w:r>
+      <w:r>
+        <w:rPr>
+          <w:b/>
+          <w:bCs/>
+        </w:rPr>
+        <w:t xml:space="preserve">“real software.”</w:t>
+      </w:r>
+      <w:r>
+        <w:t xml:space="preserve"> </w:t>
+      </w:r>
+      <w:r>
+        <w:t xml:space="preserve">This is real software, battle-tested: 12,269 check-ups for internal and external agencies, 100 trap documents designed to fool it, an independent referee co-signing every report, and a public record of every change — and it is free. Nothing here asks for trust; every claim here is checkable by anyone:</w:t>
       </w:r>
     </w:p>
     <w:p>

</xml_diff>

<commit_message>
copy: the objection trimmed to its two strongest sentences
"But... but one person built this. It's not Google or Microsoft or
Adobe." — answered "True — and it doesn't need to be." The
battle-tested rebuttal (live check-up and trap counts, the referee,
the public record, free) stays. Date stamp rolls to AUG 29.
</commit_message>
<xml_diff>
--- a/docs/brief/checker-brief.docx
+++ b/docs/brief/checker-brief.docx
@@ -20,7 +20,7 @@
           <w:b/>
           <w:bCs/>
         </w:rPr>
-        <w:t xml:space="preserve">REPORT GENERATED: AUGUST 28, 2026 — every number below was pulled live from the running system on this date. Regenerated with fresh numbers at every release.</w:t>
+        <w:t xml:space="preserve">REPORT GENERATED: AUGUST 29, 2026 — every number below was pulled live from the running system on this date. Regenerated with fresh numbers at every release.</w:t>
       </w:r>
     </w:p>
     <w:p>
@@ -98,7 +98,7 @@
           <w:b/>
           <w:bCs/>
         </w:rPr>
-        <w:t xml:space="preserve">690</w:t>
+        <w:t xml:space="preserve">691</w:t>
       </w:r>
       <w:r>
         <w:t xml:space="preserve"> </w:t>
@@ -960,13 +960,13 @@
       </w:r>
     </w:p>
     <w:bookmarkEnd w:id="16"/>
-    <w:bookmarkStart w:id="19" w:name="six-months.-690-changes.-122-versions."/>
+    <w:bookmarkStart w:id="19" w:name="six-months.-691-changes.-122-versions."/>
     <w:p>
       <w:pPr>
         <w:pStyle w:val="Heading2"/>
       </w:pPr>
       <w:r>
-        <w:t xml:space="preserve">Six months. 690 changes. 122 versions.</w:t>
+        <w:t xml:space="preserve">Six months. 691 changes. 122 versions.</w:t>
       </w:r>
     </w:p>
     <w:p>
@@ -974,7 +974,7 @@
         <w:pStyle w:val="FirstParagraph"/>
       </w:pPr>
       <w:r>
-        <w:t xml:space="preserve">Not a weekend project. Since March it has grown from a single PDF check into a checker for four kinds of files — 250 saved changes in the last 30 days alone, its battery of self-checks grown from about 1,500 in June to 2,924 today. All of it is public, on GitHub:</w:t>
+        <w:t xml:space="preserve">Not a weekend project. Since March it has grown from a single PDF check into a checker for four kinds of files — 251 saved changes in the last 30 days alone, its battery of self-checks grown from about 1,500 in June to 2,924 today. All of it is public, on GitHub:</w:t>
       </w:r>
       <w:r>
         <w:t xml:space="preserve"> </w:t>
@@ -1025,13 +1025,13 @@
       </w:r>
     </w:p>
     <w:bookmarkEnd w:id="19"/>
-    <w:bookmarkStart w:id="20" w:name="X3db6ff76fb4629a3eb8cdd4d7fcfc27df0dce42"/>
+    <w:bookmarkStart w:id="20" w:name="X8681914088954a3545c64ca0253625a2f575c6c"/>
     <w:p>
       <w:pPr>
         <w:pStyle w:val="Heading2"/>
       </w:pPr>
       <w:r>
-        <w:t xml:space="preserve">“But… but one person built this. It’s not Google or Microsoft or Adobe. The developer is not on executive staff. They’ve been here at ICJIA forever. Why are we even looking at this? Let’s just buy real software.”</w:t>
+        <w:t xml:space="preserve">“But… but one person built this. It’s not Google or Microsoft or Adobe.”</w:t>
       </w:r>
     </w:p>
     <w:p>
@@ -1043,21 +1043,7 @@
           <w:b/>
           <w:bCs/>
         </w:rPr>
-        <w:t xml:space="preserve">True — every word, right up until</w:t>
-      </w:r>
-      <w:r>
-        <w:rPr>
-          <w:b/>
-          <w:bCs/>
-        </w:rPr>
-        <w:t xml:space="preserve"> </w:t>
-      </w:r>
-      <w:r>
-        <w:rPr>
-          <w:b/>
-          <w:bCs/>
-        </w:rPr>
-        <w:t xml:space="preserve">“real software.”</w:t>
+        <w:t xml:space="preserve">True — and it doesn’t need to be.</w:t>
       </w:r>
       <w:r>
         <w:t xml:space="preserve"> </w:t>

</xml_diff>

<commit_message>
copy: the hero becomes "Built to be checked. So check it."
The old tagline spent "the person who built it" in the hero — the same
card the objection section now plays better. The new line matches the
document title, states the actual thesis (verifiability, not
reputation), and keeps the imperative. The sub-line ("Every claim on
this page can be verified without taking anyone's word for it —
including ours") already carries the skeptic stance.
</commit_message>
<xml_diff>
--- a/docs/brief/checker-brief.docx
+++ b/docs/brief/checker-brief.docx
@@ -2,13 +2,13 @@
 <file path=word/document.xml><?xml version="1.0" encoding="utf-8"?>
 <w:document xmlns:w="http://schemas.openxmlformats.org/wordprocessingml/2006/main" xmlns:m="http://schemas.openxmlformats.org/officeDocument/2006/math" xmlns:r="http://schemas.openxmlformats.org/officeDocument/2006/relationships" xmlns:o="urn:schemas-microsoft-com:office:office" xmlns:v="urn:schemas-microsoft-com:vml" xmlns:w10="urn:schemas-microsoft-com:office:word" xmlns:a="http://schemas.openxmlformats.org/drawingml/2006/main" xmlns:pic="http://schemas.openxmlformats.org/drawingml/2006/picture" xmlns:wp="http://schemas.openxmlformats.org/drawingml/2006/wordprocessingDrawing">
   <w:body>
-    <w:bookmarkStart w:id="22" w:name="Xbbba7d4b807ed2db8b46be233cb715d08c14d1f"/>
+    <w:bookmarkStart w:id="22" w:name="built-to-be-checked.-so-check-it."/>
     <w:p>
       <w:pPr>
         <w:pStyle w:val="Heading1"/>
       </w:pPr>
       <w:r>
-        <w:t xml:space="preserve">Don’t trust the person who built it. Check it yourself.</w:t>
+        <w:t xml:space="preserve">Built to be checked. So check it.</w:t>
       </w:r>
     </w:p>
     <w:p>
@@ -98,7 +98,7 @@
           <w:b/>
           <w:bCs/>
         </w:rPr>
-        <w:t xml:space="preserve">691</w:t>
+        <w:t xml:space="preserve">692</w:t>
       </w:r>
       <w:r>
         <w:t xml:space="preserve"> </w:t>
@@ -960,13 +960,13 @@
       </w:r>
     </w:p>
     <w:bookmarkEnd w:id="16"/>
-    <w:bookmarkStart w:id="19" w:name="six-months.-691-changes.-122-versions."/>
+    <w:bookmarkStart w:id="19" w:name="six-months.-692-changes.-122-versions."/>
     <w:p>
       <w:pPr>
         <w:pStyle w:val="Heading2"/>
       </w:pPr>
       <w:r>
-        <w:t xml:space="preserve">Six months. 691 changes. 122 versions.</w:t>
+        <w:t xml:space="preserve">Six months. 692 changes. 122 versions.</w:t>
       </w:r>
     </w:p>
     <w:p>
@@ -974,7 +974,7 @@
         <w:pStyle w:val="FirstParagraph"/>
       </w:pPr>
       <w:r>
-        <w:t xml:space="preserve">Not a weekend project. Since March it has grown from a single PDF check into a checker for four kinds of files — 251 saved changes in the last 30 days alone, its battery of self-checks grown from about 1,500 in June to 2,924 today. All of it is public, on GitHub:</w:t>
+        <w:t xml:space="preserve">Not a weekend project. Since March it has grown from a single PDF check into a checker for four kinds of files — 252 saved changes in the last 30 days alone, its battery of self-checks grown from about 1,500 in June to 2,924 today. All of it is public, on GitHub:</w:t>
       </w:r>
       <w:r>
         <w:t xml:space="preserve"> </w:t>

</xml_diff>

<commit_message>
copy: sixth check card — "Free & open source"
The objection lede and the SiteImprove section already said free; the
check-card grid now says it as its own card (and fills the empty sixth
slot): no license, no subscription, no per-seat fee; the code readable,
copyable, runnable elsewhere. Nothing to buy, nothing hidden to sell.
</commit_message>
<xml_diff>
--- a/docs/brief/checker-brief.docx
+++ b/docs/brief/checker-brief.docx
@@ -50,13 +50,13 @@
           <w:b/>
           <w:bCs/>
         </w:rPr>
-        <w:t xml:space="preserve">12,278</w:t>
-      </w:r>
-      <w:r>
-        <w:t xml:space="preserve"> </w:t>
-      </w:r>
-      <w:r>
-        <w:t xml:space="preserve">check-ups run for internal and external agencies — the quick per-file check-up that has caught on beyond ICJIA: easier than SiteImprove, clearer than PAC. 8,168 in the last 30 days alone. ·</w:t>
+        <w:t xml:space="preserve">12,281</w:t>
+      </w:r>
+      <w:r>
+        <w:t xml:space="preserve"> </w:t>
+      </w:r>
+      <w:r>
+        <w:t xml:space="preserve">check-ups run for internal and external agencies — the quick per-file check-up that has caught on beyond ICJIA: easier than SiteImprove, clearer than PAC. 8,171 in the last 30 days alone. ·</w:t>
       </w:r>
       <w:r>
         <w:t xml:space="preserve"> </w:t>
@@ -98,7 +98,7 @@
           <w:b/>
           <w:bCs/>
         </w:rPr>
-        <w:t xml:space="preserve">695</w:t>
+        <w:t xml:space="preserve">696</w:t>
       </w:r>
       <w:r>
         <w:t xml:space="preserve"> </w:t>
@@ -1042,13 +1042,13 @@
       </w:r>
     </w:p>
     <w:bookmarkEnd w:id="17"/>
-    <w:bookmarkStart w:id="20" w:name="six-months.-695-changes.-125-versions."/>
+    <w:bookmarkStart w:id="20" w:name="six-months.-696-changes.-125-versions."/>
     <w:p>
       <w:pPr>
         <w:pStyle w:val="Heading2"/>
       </w:pPr>
       <w:r>
-        <w:t xml:space="preserve">Six months. 695 changes. 125 versions.</w:t>
+        <w:t xml:space="preserve">Six months. 696 changes. 125 versions.</w:t>
       </w:r>
     </w:p>
     <w:p>
@@ -1056,7 +1056,7 @@
         <w:pStyle w:val="FirstParagraph"/>
       </w:pPr>
       <w:r>
-        <w:t xml:space="preserve">Not a weekend project. Since March it has grown from a single PDF check into a checker for four kinds of files — 255 saved changes in the last 30 days alone, its battery of self-checks grown from about 1,500 in June to 2,949 today. All of it is public, on GitHub:</w:t>
+        <w:t xml:space="preserve">Not a weekend project. Since March it has grown from a single PDF check into a checker for four kinds of files — 256 saved changes in the last 30 days alone, its battery of self-checks grown from about 1,500 in June to 2,949 today. All of it is public, on GitHub:</w:t>
       </w:r>
       <w:r>
         <w:t xml:space="preserve"> </w:t>
@@ -1131,7 +1131,7 @@
         <w:t xml:space="preserve"> </w:t>
       </w:r>
       <w:r>
-        <w:t xml:space="preserve">This is real software, battle-tested: 12,278 check-ups for internal and external agencies, 115 trap documents designed to fool it, an independent referee co-signing every report, and a public record of every change — and it is free. Nothing here asks for trust; every claim here is checkable by anyone:</w:t>
+        <w:t xml:space="preserve">This is real software, battle-tested: 12,281 check-ups for internal and external agencies, 115 trap documents designed to fool it, an independent referee co-signing every report, and a public record of every change — and it is free. Nothing here asks for trust; every claim here is checkable by anyone:</w:t>
       </w:r>
     </w:p>
     <w:p>
@@ -1242,6 +1242,28 @@
       </w:r>
       <w:r>
         <w:t xml:space="preserve">Inside it runs qpdf, veraPDF, and the Matterhorn Protocol — the same open tools and test model used every day by professional remediators and certified accessibility specialists worldwide. One person assembled them; the world builds and checks them.</w:t>
+      </w:r>
+    </w:p>
+    <w:p>
+      <w:pPr>
+        <w:pStyle w:val="Compact"/>
+        <w:numPr>
+          <w:ilvl w:val="0"/>
+          <w:numId w:val="1002"/>
+        </w:numPr>
+      </w:pPr>
+      <w:r>
+        <w:rPr>
+          <w:b/>
+          <w:bCs/>
+        </w:rPr>
+        <w:t xml:space="preserve">Free &amp; open source.</w:t>
+      </w:r>
+      <w:r>
+        <w:t xml:space="preserve"> </w:t>
+      </w:r>
+      <w:r>
+        <w:t xml:space="preserve">No license, no subscription, no per-seat fee — run as many check-ups as you like, from any agency. The whole thing is open source: the code can be read, copied, run on your own servers, and checked line by line. There is nothing to buy, and nothing hidden to sell.</w:t>
       </w:r>
     </w:p>
     <w:p>

</xml_diff>

<commit_message>
copy: "The best analysis tools" — qpdf, veraPDF, and all 31 Matterhorn points
The card now says what the tools ARE (the field's best-of-breed
analysis tools) and what the checker does with them (checks all 31
points of the Matterhorn Protocol, the industry's official test
model), keeping the closer: one person assembled them; the world
builds and checks them.
</commit_message>
<xml_diff>
--- a/docs/brief/checker-brief.docx
+++ b/docs/brief/checker-brief.docx
@@ -98,7 +98,7 @@
           <w:b/>
           <w:bCs/>
         </w:rPr>
-        <w:t xml:space="preserve">696</w:t>
+        <w:t xml:space="preserve">697</w:t>
       </w:r>
       <w:r>
         <w:t xml:space="preserve"> </w:t>
@@ -1042,13 +1042,13 @@
       </w:r>
     </w:p>
     <w:bookmarkEnd w:id="17"/>
-    <w:bookmarkStart w:id="20" w:name="six-months.-696-changes.-125-versions."/>
+    <w:bookmarkStart w:id="20" w:name="six-months.-697-changes.-125-versions."/>
     <w:p>
       <w:pPr>
         <w:pStyle w:val="Heading2"/>
       </w:pPr>
       <w:r>
-        <w:t xml:space="preserve">Six months. 696 changes. 125 versions.</w:t>
+        <w:t xml:space="preserve">Six months. 697 changes. 125 versions.</w:t>
       </w:r>
     </w:p>
     <w:p>
@@ -1056,7 +1056,7 @@
         <w:pStyle w:val="FirstParagraph"/>
       </w:pPr>
       <w:r>
-        <w:t xml:space="preserve">Not a weekend project. Since March it has grown from a single PDF check into a checker for four kinds of files — 256 saved changes in the last 30 days alone, its battery of self-checks grown from about 1,500 in June to 2,949 today. All of it is public, on GitHub:</w:t>
+        <w:t xml:space="preserve">Not a weekend project. Since March it has grown from a single PDF check into a checker for four kinds of files — 257 saved changes in the last 30 days alone, its battery of self-checks grown from about 1,500 in June to 2,949 today. All of it is public, on GitHub:</w:t>
       </w:r>
       <w:r>
         <w:t xml:space="preserve"> </w:t>
@@ -1235,13 +1235,13 @@
           <w:b/>
           <w:bCs/>
         </w:rPr>
-        <w:t xml:space="preserve">The world’s own tools.</w:t>
-      </w:r>
-      <w:r>
-        <w:t xml:space="preserve"> </w:t>
-      </w:r>
-      <w:r>
-        <w:t xml:space="preserve">Inside it runs qpdf, veraPDF, and the Matterhorn Protocol — the same open tools and test model used every day by professional remediators and certified accessibility specialists worldwide. One person assembled them; the world builds and checks them.</w:t>
+        <w:t xml:space="preserve">The best analysis tools.</w:t>
+      </w:r>
+      <w:r>
+        <w:t xml:space="preserve"> </w:t>
+      </w:r>
+      <w:r>
+        <w:t xml:space="preserve">Inside it runs qpdf and veraPDF — the accessibility field’s own best-of-breed analysis tools, used every day by professional remediators and certified specialists worldwide — and it checks all 31 points of the Matterhorn Protocol, the PDF industry’s official test model. One person assembled them; the world builds and checks them.</w:t>
       </w:r>
     </w:p>
     <w:p>

</xml_diff>

<commit_message>
fix: the "Free & open source" card belongs INSIDE the check grid
The card was appended after the grid container's closing tag (an
earlier regex swallowed it), so it rendered as a full-width block
below the grid instead of taking the empty sixth cell beside "The best
analysis tools". Now inside .checks — six cards, two clean rows.
</commit_message>
<xml_diff>
--- a/docs/brief/checker-brief.docx
+++ b/docs/brief/checker-brief.docx
@@ -50,13 +50,13 @@
           <w:b/>
           <w:bCs/>
         </w:rPr>
-        <w:t xml:space="preserve">12,281</w:t>
-      </w:r>
-      <w:r>
-        <w:t xml:space="preserve"> </w:t>
-      </w:r>
-      <w:r>
-        <w:t xml:space="preserve">check-ups run for internal and external agencies — the quick per-file check-up that has caught on beyond ICJIA: easier than SiteImprove, clearer than PAC. 8,171 in the last 30 days alone. ·</w:t>
+        <w:t xml:space="preserve">12,284</w:t>
+      </w:r>
+      <w:r>
+        <w:t xml:space="preserve"> </w:t>
+      </w:r>
+      <w:r>
+        <w:t xml:space="preserve">check-ups run for internal and external agencies — the quick per-file check-up that has caught on beyond ICJIA: easier than SiteImprove, clearer than PAC. 8,174 in the last 30 days alone. ·</w:t>
       </w:r>
       <w:r>
         <w:t xml:space="preserve"> </w:t>
@@ -98,7 +98,7 @@
           <w:b/>
           <w:bCs/>
         </w:rPr>
-        <w:t xml:space="preserve">697</w:t>
+        <w:t xml:space="preserve">698</w:t>
       </w:r>
       <w:r>
         <w:t xml:space="preserve"> </w:t>
@@ -1042,13 +1042,13 @@
       </w:r>
     </w:p>
     <w:bookmarkEnd w:id="17"/>
-    <w:bookmarkStart w:id="20" w:name="six-months.-697-changes.-125-versions."/>
+    <w:bookmarkStart w:id="20" w:name="six-months.-698-changes.-125-versions."/>
     <w:p>
       <w:pPr>
         <w:pStyle w:val="Heading2"/>
       </w:pPr>
       <w:r>
-        <w:t xml:space="preserve">Six months. 697 changes. 125 versions.</w:t>
+        <w:t xml:space="preserve">Six months. 698 changes. 125 versions.</w:t>
       </w:r>
     </w:p>
     <w:p>
@@ -1056,7 +1056,7 @@
         <w:pStyle w:val="FirstParagraph"/>
       </w:pPr>
       <w:r>
-        <w:t xml:space="preserve">Not a weekend project. Since March it has grown from a single PDF check into a checker for four kinds of files — 257 saved changes in the last 30 days alone, its battery of self-checks grown from about 1,500 in June to 2,949 today. All of it is public, on GitHub:</w:t>
+        <w:t xml:space="preserve">Not a weekend project. Since March it has grown from a single PDF check into a checker for four kinds of files — 258 saved changes in the last 30 days alone, its battery of self-checks grown from about 1,500 in June to 2,949 today. All of it is public, on GitHub:</w:t>
       </w:r>
       <w:r>
         <w:t xml:space="preserve"> </w:t>
@@ -1131,7 +1131,7 @@
         <w:t xml:space="preserve"> </w:t>
       </w:r>
       <w:r>
-        <w:t xml:space="preserve">This is real software, battle-tested: 12,281 check-ups for internal and external agencies, 115 trap documents designed to fool it, an independent referee co-signing every report, and a public record of every change — and it is free. Nothing here asks for trust; every claim here is checkable by anyone:</w:t>
+        <w:t xml:space="preserve">This is real software, battle-tested: 12,284 check-ups for internal and external agencies, 115 trap documents designed to fool it, an independent referee co-signing every report, and a public record of every change — and it is free. Nothing here asks for trust; every claim here is checkable by anyone:</w:t>
       </w:r>
     </w:p>
     <w:p>

</xml_diff>

<commit_message>
traps: a class-map trap for the preemptive fix (corpus 120)
The encoding-invariance gate found class-map attributes; this puts the
same defect in the public inventory, where the trap modal lists it.
Sabotage-verified: with the /C route disabled, the trap fails with the
production symptom (89/B, scope read as missing) and the gate fails
too — two independent locks on one behavior.
</commit_message>
<xml_diff>
--- a/docs/brief/checker-brief.docx
+++ b/docs/brief/checker-brief.docx
@@ -82,7 +82,7 @@
           <w:b/>
           <w:bCs/>
         </w:rPr>
-        <w:t xml:space="preserve">119 / 119</w:t>
+        <w:t xml:space="preserve">120 / 120</w:t>
       </w:r>
       <w:r>
         <w:t xml:space="preserve"> </w:t>
@@ -98,7 +98,7 @@
           <w:b/>
           <w:bCs/>
         </w:rPr>
-        <w:t xml:space="preserve">702</w:t>
+        <w:t xml:space="preserve">703</w:t>
       </w:r>
       <w:r>
         <w:t xml:space="preserve"> </w:t>
@@ -515,13 +515,13 @@
       </w:r>
     </w:p>
     <w:bookmarkEnd w:id="12"/>
-    <w:bookmarkStart w:id="13" w:name="Xa2be9182f65758e12e5e5399eccfdf86983e7b9"/>
+    <w:bookmarkStart w:id="13" w:name="Xdf773d1601631ead4fe5c10d8115bbbc22be434"/>
     <w:p>
       <w:pPr>
         <w:pStyle w:val="Heading2"/>
       </w:pPr>
       <w:r>
-        <w:t xml:space="preserve">We built 119 documents designed to fool it — PDFs modeled on Canva, InDesign, and Word, plus native Word, PowerPoint, and Excel traps</w:t>
+        <w:t xml:space="preserve">We built 120 documents designed to fool it — PDFs modeled on Canva, InDesign, and Word, plus native Word, PowerPoint, and Excel traps</w:t>
       </w:r>
     </w:p>
     <w:p>
@@ -576,7 +576,7 @@
           <w:b/>
           <w:bCs/>
         </w:rPr>
-        <w:t xml:space="preserve">All 119 held</w:t>
+        <w:t xml:space="preserve">All 120 held</w:t>
       </w:r>
       <w:r>
         <w:t xml:space="preserve"> </w:t>
@@ -838,7 +838,7 @@
         <w:pStyle w:val="FirstParagraph"/>
       </w:pPr>
       <w:r>
-        <w:t xml:space="preserve">Twelve gates stand between a code change and the live site, run automatically on every change; one failure stops the release cold. On every change: the 2,971 self-checks (every promise ever made, re-tested); the 119 trap documents rebuilt and re-judged; the scoring invariant (the grade shown must always match the score computed); the</w:t>
+        <w:t xml:space="preserve">Twelve gates stand between a code change and the live site, run automatically on every change; one failure stops the release cold. On every change: the 2,971 self-checks (every promise ever made, re-tested); the 120 trap documents rebuilt and re-judged; the scoring invariant (the grade shown must always match the score computed); the</w:t>
       </w:r>
       <w:r>
         <w:t xml:space="preserve"> </w:t>
@@ -1064,13 +1064,13 @@
       </w:r>
     </w:p>
     <w:bookmarkEnd w:id="17"/>
-    <w:bookmarkStart w:id="20" w:name="six-months.-702-changes.-129-versions."/>
+    <w:bookmarkStart w:id="20" w:name="six-months.-703-changes.-129-versions."/>
     <w:p>
       <w:pPr>
         <w:pStyle w:val="Heading2"/>
       </w:pPr>
       <w:r>
-        <w:t xml:space="preserve">Six months. 702 changes. 129 versions.</w:t>
+        <w:t xml:space="preserve">Six months. 703 changes. 129 versions.</w:t>
       </w:r>
     </w:p>
     <w:p>
@@ -1078,7 +1078,7 @@
         <w:pStyle w:val="FirstParagraph"/>
       </w:pPr>
       <w:r>
-        <w:t xml:space="preserve">Not a weekend project. Since March it has grown from a single PDF check into a checker for four kinds of files — 262 saved changes in the last 30 days alone, its battery of self-checks grown from about 1,500 in June to 2,971 today. All of it is public, on GitHub:</w:t>
+        <w:t xml:space="preserve">Not a weekend project. Since March it has grown from a single PDF check into a checker for four kinds of files — 263 saved changes in the last 30 days alone, its battery of self-checks grown from about 1,500 in June to 2,971 today. All of it is public, on GitHub:</w:t>
       </w:r>
       <w:r>
         <w:t xml:space="preserve"> </w:t>
@@ -1109,7 +1109,7 @@
         </w:r>
       </w:hyperlink>
       <w:r>
-        <w:t xml:space="preserve">, open for anyone to read. Milestones, newest first: passes its own trap test 119/119 · fixed the outlier that wrongly refused a 246-page annual report — traced to the server, not the file, with proof · made its own grading</w:t>
+        <w:t xml:space="preserve">, open for anyone to read. Milestones, newest first: passes its own trap test 120/120 · fixed the outlier that wrongly refused a 246-page annual report — traced to the server, not the file, with proof · made its own grading</w:t>
       </w:r>
       <w:r>
         <w:t xml:space="preserve"> </w:t>
@@ -1153,7 +1153,7 @@
         <w:t xml:space="preserve"> </w:t>
       </w:r>
       <w:r>
-        <w:t xml:space="preserve">This is real software, battle-tested: 12,297 check-ups for internal and external agencies, 119 trap documents designed to fool it, an independent referee co-signing every report, and a public record of every change — and it is free. Nothing here asks for trust; every claim here is checkable by anyone:</w:t>
+        <w:t xml:space="preserve">This is real software, battle-tested: 12,297 check-ups for internal and external agencies, 120 trap documents designed to fool it, an independent referee co-signing every report, and a public record of every change — and it is free. Nothing here asks for trust; every claim here is checkable by anyone:</w:t>
       </w:r>
     </w:p>
     <w:p>
@@ -1219,7 +1219,7 @@
         <w:t xml:space="preserve"> </w:t>
       </w:r>
       <w:r>
-        <w:t xml:space="preserve">Before anything new goes live, the software re-runs every promise it has ever made — all 2,971 must pass. A single failure stops the release cold: fix it, then run the full battery again from the top. A few of those promises, in plain words: a scanned page with no readable text must score zero (no partial credit for a picture of words); a file with no tables must never be graded on tables; the grade on screen and the grade in the downloaded report must match, digit for digit; an image description made of nothing but blank spaces must be caught as empty; a re-saved copy of a document must receive the identical grade, digit for digit; and all 119 trap documents must still be judged correctly, every release.</w:t>
+        <w:t xml:space="preserve">Before anything new goes live, the software re-runs every promise it has ever made — all 2,971 must pass. A single failure stops the release cold: fix it, then run the full battery again from the top. A few of those promises, in plain words: a scanned page with no readable text must score zero (no partial credit for a picture of words); a file with no tables must never be graded on tables; the grade on screen and the grade in the downloaded report must match, digit for digit; an image description made of nothing but blank spaces must be caught as empty; a re-saved copy of a document must receive the identical grade, digit for digit; and all 120 trap documents must still be judged correctly, every release.</w:t>
       </w:r>
     </w:p>
     <w:p>
@@ -1345,13 +1345,13 @@
       </w:r>
     </w:p>
     <w:bookmarkEnd w:id="21"/>
-    <w:bookmarkStart w:id="22" w:name="appendix-the-119-trap-documents"/>
+    <w:bookmarkStart w:id="22" w:name="appendix-the-120-trap-documents"/>
     <w:p>
       <w:pPr>
         <w:pStyle w:val="Heading2"/>
       </w:pPr>
       <w:r>
-        <w:t xml:space="preserve">Appendix: the 119 trap documents</w:t>
+        <w:t xml:space="preserve">Appendix: the 120 trap documents</w:t>
       </w:r>
     </w:p>
     <w:p>
@@ -4743,6 +4743,38 @@
           <w:iCs/>
         </w:rPr>
         <w:t xml:space="preserve">(passed clean)</w:t>
+      </w:r>
+    </w:p>
+    <w:p>
+      <w:pPr>
+        <w:pStyle w:val="Compact"/>
+        <w:numPr>
+          <w:ilvl w:val="0"/>
+          <w:numId w:val="1003"/>
+        </w:numPr>
+      </w:pPr>
+      <w:r>
+        <w:rPr>
+          <w:b/>
+          <w:bCs/>
+        </w:rPr>
+        <w:t xml:space="preserve">synthetic-120</w:t>
+      </w:r>
+      <w:r>
+        <w:t xml:space="preserve"> </w:t>
+      </w:r>
+      <w:r>
+        <w:t xml:space="preserve">— Header directions attached by class — the third legal route, caught before any file used it</w:t>
+      </w:r>
+      <w:r>
+        <w:t xml:space="preserve"> </w:t>
+      </w:r>
+      <w:r>
+        <w:rPr>
+          <w:i/>
+          <w:iCs/>
+        </w:rPr>
+        <w:t xml:space="preserve">(found a real bug)</w:t>
       </w:r>
     </w:p>
     <w:p>

</xml_diff>

<commit_message>
release: v1.139.2 — the trap modal ends on the highest trap
USER (second report, and RIGHT where my first check was incomplete):
'this is still showing 115.' All 124 cards were present — I had
counted them — but the manifest merge concatenated the PDF battery
(...100, then 116-124) BEFORE the Office battery (101-115), so the
modal's last card was synthetic-115 and a reader scrolling to the
bottom read that as the total.

The merge now sorts numerically across both batteries (01 -> 124,
verified strictly ascending in the regenerated trustBody), and a new
trustPage test pins the invariant: card order strictly ascending,
always ending on the highest-numbered trap — a future battery can
never make the bottom of the list understate the count again.

Tests 3,005 -> 3,006. Versions x6, CHANGELOG, README, §10.
</commit_message>
<xml_diff>
--- a/docs/brief/checker-brief.docx
+++ b/docs/brief/checker-brief.docx
@@ -66,7 +66,7 @@
           <w:b/>
           <w:bCs/>
         </w:rPr>
-        <w:t xml:space="preserve">3,005</w:t>
+        <w:t xml:space="preserve">3,006</w:t>
       </w:r>
       <w:r>
         <w:t xml:space="preserve"> </w:t>
@@ -98,7 +98,7 @@
           <w:b/>
           <w:bCs/>
         </w:rPr>
-        <w:t xml:space="preserve">716</w:t>
+        <w:t xml:space="preserve">717</w:t>
       </w:r>
       <w:r>
         <w:t xml:space="preserve"> </w:t>
@@ -854,7 +854,7 @@
         <w:pStyle w:val="FirstParagraph"/>
       </w:pPr>
       <w:r>
-        <w:t xml:space="preserve">Twelve gates stand between a code change and the live site, run automatically on every change; one failure stops the release cold. On every change: the 3,005 self-checks (every promise ever made, re-tested); the 124 trap documents rebuilt and re-judged; the scoring invariant (the grade shown must always match the score computed); the</w:t>
+        <w:t xml:space="preserve">Twelve gates stand between a code change and the live site, run automatically on every change; one failure stops the release cold. On every change: the 3,006 self-checks (every promise ever made, re-tested); the 124 trap documents rebuilt and re-judged; the scoring invariant (the grade shown must always match the score computed); the</w:t>
       </w:r>
       <w:r>
         <w:t xml:space="preserve"> </w:t>
@@ -1080,13 +1080,13 @@
       </w:r>
     </w:p>
     <w:bookmarkEnd w:id="17"/>
-    <w:bookmarkStart w:id="20" w:name="six-months.-716-changes.-139-versions."/>
+    <w:bookmarkStart w:id="20" w:name="six-months.-717-changes.-139-versions."/>
     <w:p>
       <w:pPr>
         <w:pStyle w:val="Heading2"/>
       </w:pPr>
       <w:r>
-        <w:t xml:space="preserve">Six months. 716 changes. 139 versions.</w:t>
+        <w:t xml:space="preserve">Six months. 717 changes. 139 versions.</w:t>
       </w:r>
     </w:p>
     <w:p>
@@ -1094,7 +1094,7 @@
         <w:pStyle w:val="FirstParagraph"/>
       </w:pPr>
       <w:r>
-        <w:t xml:space="preserve">Not a weekend project. Since March it has grown from a single PDF check into a checker for four kinds of files — 276 saved changes in the last 30 days alone, its battery of self-checks grown from about 1,500 in June to 3,005 today. All of it is public, on GitHub:</w:t>
+        <w:t xml:space="preserve">Not a weekend project. Since March it has grown from a single PDF check into a checker for four kinds of files — 277 saved changes in the last 30 days alone, its battery of self-checks grown from about 1,500 in June to 3,006 today. All of it is public, on GitHub:</w:t>
       </w:r>
       <w:r>
         <w:t xml:space="preserve"> </w:t>
@@ -1229,13 +1229,13 @@
           <w:b/>
           <w:bCs/>
         </w:rPr>
-        <w:t xml:space="preserve">3,005 self-checks.</w:t>
-      </w:r>
-      <w:r>
-        <w:t xml:space="preserve"> </w:t>
-      </w:r>
-      <w:r>
-        <w:t xml:space="preserve">Before anything new goes live, the software re-runs every promise it has ever made — all 3,005 must pass. A single failure stops the release cold: fix it, then run the full battery again from the top. A few of those promises, in plain words: a scanned page with no readable text must score zero (no partial credit for a picture of words); a file with no tables must never be graded on tables; the grade on screen and the grade in the downloaded report must match, digit for digit; an image description made of nothing but blank spaces must be caught as empty; a re-saved copy of a document must receive the identical grade, digit for digit; and all 124 trap documents must still be judged correctly, every release.</w:t>
+        <w:t xml:space="preserve">3,006 self-checks.</w:t>
+      </w:r>
+      <w:r>
+        <w:t xml:space="preserve"> </w:t>
+      </w:r>
+      <w:r>
+        <w:t xml:space="preserve">Before anything new goes live, the software re-runs every promise it has ever made — all 3,006 must pass. A single failure stops the release cold: fix it, then run the full battery again from the top. A few of those promises, in plain words: a scanned page with no readable text must score zero (no partial credit for a picture of words); a file with no tables must never be graded on tables; the grade on screen and the grade in the downloaded report must match, digit for digit; an image description made of nothing but blank spaces must be caught as empty; a re-saved copy of a document must receive the identical grade, digit for digit; and all 124 trap documents must still be judged correctly, every release.</w:t>
       </w:r>
     </w:p>
     <w:p>
@@ -4646,6 +4646,504 @@
           <w:b/>
           <w:bCs/>
         </w:rPr>
+        <w:t xml:space="preserve">synthetic-101</w:t>
+      </w:r>
+      <w:r>
+        <w:t xml:space="preserve"> </w:t>
+      </w:r>
+      <w:r>
+        <w:t xml:space="preserve">— Word: bold 16-point text instead of Heading styles</w:t>
+      </w:r>
+      <w:r>
+        <w:t xml:space="preserve"> </w:t>
+      </w:r>
+      <w:r>
+        <w:rPr>
+          <w:i/>
+          <w:iCs/>
+        </w:rPr>
+        <w:t xml:space="preserve">(caught)</w:t>
+      </w:r>
+    </w:p>
+    <w:p>
+      <w:pPr>
+        <w:pStyle w:val="Compact"/>
+        <w:numPr>
+          <w:ilvl w:val="0"/>
+          <w:numId w:val="1003"/>
+        </w:numPr>
+      </w:pPr>
+      <w:r>
+        <w:rPr>
+          <w:b/>
+          <w:bCs/>
+        </w:rPr>
+        <w:t xml:space="preserve">synthetic-102</w:t>
+      </w:r>
+      <w:r>
+        <w:t xml:space="preserve"> </w:t>
+      </w:r>
+      <w:r>
+        <w:t xml:space="preserve">— Word: the same document with real Heading styles</w:t>
+      </w:r>
+      <w:r>
+        <w:t xml:space="preserve"> </w:t>
+      </w:r>
+      <w:r>
+        <w:rPr>
+          <w:i/>
+          <w:iCs/>
+        </w:rPr>
+        <w:t xml:space="preserve">(passed clean)</w:t>
+      </w:r>
+    </w:p>
+    <w:p>
+      <w:pPr>
+        <w:pStyle w:val="Compact"/>
+        <w:numPr>
+          <w:ilvl w:val="0"/>
+          <w:numId w:val="1003"/>
+        </w:numPr>
+      </w:pPr>
+      <w:r>
+        <w:rPr>
+          <w:b/>
+          <w:bCs/>
+        </w:rPr>
+        <w:t xml:space="preserve">synthetic-103</w:t>
+      </w:r>
+      <w:r>
+        <w:t xml:space="preserve"> </w:t>
+      </w:r>
+      <w:r>
+        <w:t xml:space="preserve">— Word: two pictures, alt panel never opened</w:t>
+      </w:r>
+      <w:r>
+        <w:t xml:space="preserve"> </w:t>
+      </w:r>
+      <w:r>
+        <w:rPr>
+          <w:i/>
+          <w:iCs/>
+        </w:rPr>
+        <w:t xml:space="preserve">(caught)</w:t>
+      </w:r>
+    </w:p>
+    <w:p>
+      <w:pPr>
+        <w:pStyle w:val="Compact"/>
+        <w:numPr>
+          <w:ilvl w:val="0"/>
+          <w:numId w:val="1003"/>
+        </w:numPr>
+      </w:pPr>
+      <w:r>
+        <w:rPr>
+          <w:b/>
+          <w:bCs/>
+        </w:rPr>
+        <w:t xml:space="preserve">synthetic-104</w:t>
+      </w:r>
+      <w:r>
+        <w:t xml:space="preserve"> </w:t>
+      </w:r>
+      <w:r>
+        <w:t xml:space="preserve">— Word: the same pictures, both described</w:t>
+      </w:r>
+      <w:r>
+        <w:t xml:space="preserve"> </w:t>
+      </w:r>
+      <w:r>
+        <w:rPr>
+          <w:i/>
+          <w:iCs/>
+        </w:rPr>
+        <w:t xml:space="preserve">(passed clean)</w:t>
+      </w:r>
+    </w:p>
+    <w:p>
+      <w:pPr>
+        <w:pStyle w:val="Compact"/>
+        <w:numPr>
+          <w:ilvl w:val="0"/>
+          <w:numId w:val="1003"/>
+        </w:numPr>
+      </w:pPr>
+      <w:r>
+        <w:rPr>
+          <w:b/>
+          <w:bCs/>
+        </w:rPr>
+        <w:t xml:space="preserve">synthetic-105</w:t>
+      </w:r>
+      <w:r>
+        <w:t xml:space="preserve"> </w:t>
+      </w:r>
+      <w:r>
+        <w:t xml:space="preserve">— Word: a table whose header row was never marked</w:t>
+      </w:r>
+      <w:r>
+        <w:t xml:space="preserve"> </w:t>
+      </w:r>
+      <w:r>
+        <w:rPr>
+          <w:i/>
+          <w:iCs/>
+        </w:rPr>
+        <w:t xml:space="preserve">(caught)</w:t>
+      </w:r>
+    </w:p>
+    <w:p>
+      <w:pPr>
+        <w:pStyle w:val="Compact"/>
+        <w:numPr>
+          <w:ilvl w:val="0"/>
+          <w:numId w:val="1003"/>
+        </w:numPr>
+      </w:pPr>
+      <w:r>
+        <w:rPr>
+          <w:b/>
+          <w:bCs/>
+        </w:rPr>
+        <w:t xml:space="preserve">synthetic-106</w:t>
+      </w:r>
+      <w:r>
+        <w:t xml:space="preserve"> </w:t>
+      </w:r>
+      <w:r>
+        <w:t xml:space="preserve">— Word: the same table, header row marked</w:t>
+      </w:r>
+      <w:r>
+        <w:t xml:space="preserve"> </w:t>
+      </w:r>
+      <w:r>
+        <w:rPr>
+          <w:i/>
+          <w:iCs/>
+        </w:rPr>
+        <w:t xml:space="preserve">(passed clean)</w:t>
+      </w:r>
+    </w:p>
+    <w:p>
+      <w:pPr>
+        <w:pStyle w:val="Compact"/>
+        <w:numPr>
+          <w:ilvl w:val="0"/>
+          <w:numId w:val="1003"/>
+        </w:numPr>
+      </w:pPr>
+      <w:r>
+        <w:rPr>
+          <w:b/>
+          <w:bCs/>
+        </w:rPr>
+        <w:t xml:space="preserve">synthetic-107</w:t>
+      </w:r>
+      <w:r>
+        <w:t xml:space="preserve"> </w:t>
+      </w:r>
+      <w:r>
+        <w:t xml:space="preserve">— Word: no document title — readers hear the filename</w:t>
+      </w:r>
+      <w:r>
+        <w:t xml:space="preserve"> </w:t>
+      </w:r>
+      <w:r>
+        <w:rPr>
+          <w:i/>
+          <w:iCs/>
+        </w:rPr>
+        <w:t xml:space="preserve">(caught)</w:t>
+      </w:r>
+    </w:p>
+    <w:p>
+      <w:pPr>
+        <w:pStyle w:val="Compact"/>
+        <w:numPr>
+          <w:ilvl w:val="0"/>
+          <w:numId w:val="1003"/>
+        </w:numPr>
+      </w:pPr>
+      <w:r>
+        <w:rPr>
+          <w:b/>
+          <w:bCs/>
+        </w:rPr>
+        <w:t xml:space="preserve">synthetic-108</w:t>
+      </w:r>
+      <w:r>
+        <w:t xml:space="preserve"> </w:t>
+      </w:r>
+      <w:r>
+        <w:t xml:space="preserve">— Word: the same document, properly titled</w:t>
+      </w:r>
+      <w:r>
+        <w:t xml:space="preserve"> </w:t>
+      </w:r>
+      <w:r>
+        <w:rPr>
+          <w:i/>
+          <w:iCs/>
+        </w:rPr>
+        <w:t xml:space="preserve">(passed clean)</w:t>
+      </w:r>
+    </w:p>
+    <w:p>
+      <w:pPr>
+        <w:pStyle w:val="Compact"/>
+        <w:numPr>
+          <w:ilvl w:val="0"/>
+          <w:numId w:val="1003"/>
+        </w:numPr>
+      </w:pPr>
+      <w:r>
+        <w:rPr>
+          <w:b/>
+          <w:bCs/>
+        </w:rPr>
+        <w:t xml:space="preserve">synthetic-109</w:t>
+      </w:r>
+      <w:r>
+        <w:t xml:space="preserve"> </w:t>
+      </w:r>
+      <w:r>
+        <w:t xml:space="preserve">— PowerPoint: slides with no titles at all</w:t>
+      </w:r>
+      <w:r>
+        <w:t xml:space="preserve"> </w:t>
+      </w:r>
+      <w:r>
+        <w:rPr>
+          <w:i/>
+          <w:iCs/>
+        </w:rPr>
+        <w:t xml:space="preserve">(caught)</w:t>
+      </w:r>
+    </w:p>
+    <w:p>
+      <w:pPr>
+        <w:pStyle w:val="Compact"/>
+        <w:numPr>
+          <w:ilvl w:val="0"/>
+          <w:numId w:val="1003"/>
+        </w:numPr>
+      </w:pPr>
+      <w:r>
+        <w:rPr>
+          <w:b/>
+          <w:bCs/>
+        </w:rPr>
+        <w:t xml:space="preserve">synthetic-110</w:t>
+      </w:r>
+      <w:r>
+        <w:t xml:space="preserve"> </w:t>
+      </w:r>
+      <w:r>
+        <w:t xml:space="preserve">— PowerPoint: the same slides, properly titled</w:t>
+      </w:r>
+      <w:r>
+        <w:t xml:space="preserve"> </w:t>
+      </w:r>
+      <w:r>
+        <w:rPr>
+          <w:i/>
+          <w:iCs/>
+        </w:rPr>
+        <w:t xml:space="preserve">(passed clean)</w:t>
+      </w:r>
+    </w:p>
+    <w:p>
+      <w:pPr>
+        <w:pStyle w:val="Compact"/>
+        <w:numPr>
+          <w:ilvl w:val="0"/>
+          <w:numId w:val="1003"/>
+        </w:numPr>
+      </w:pPr>
+      <w:r>
+        <w:rPr>
+          <w:b/>
+          <w:bCs/>
+        </w:rPr>
+        <w:t xml:space="preserve">synthetic-111</w:t>
+      </w:r>
+      <w:r>
+        <w:t xml:space="preserve"> </w:t>
+      </w:r>
+      <w:r>
+        <w:t xml:space="preserve">— PowerPoint: a slide picture with no description</w:t>
+      </w:r>
+      <w:r>
+        <w:t xml:space="preserve"> </w:t>
+      </w:r>
+      <w:r>
+        <w:rPr>
+          <w:i/>
+          <w:iCs/>
+        </w:rPr>
+        <w:t xml:space="preserve">(caught)</w:t>
+      </w:r>
+    </w:p>
+    <w:p>
+      <w:pPr>
+        <w:pStyle w:val="Compact"/>
+        <w:numPr>
+          <w:ilvl w:val="0"/>
+          <w:numId w:val="1003"/>
+        </w:numPr>
+      </w:pPr>
+      <w:r>
+        <w:rPr>
+          <w:b/>
+          <w:bCs/>
+        </w:rPr>
+        <w:t xml:space="preserve">synthetic-112</w:t>
+      </w:r>
+      <w:r>
+        <w:t xml:space="preserve"> </w:t>
+      </w:r>
+      <w:r>
+        <w:t xml:space="preserve">— PowerPoint: the same picture, described</w:t>
+      </w:r>
+      <w:r>
+        <w:t xml:space="preserve"> </w:t>
+      </w:r>
+      <w:r>
+        <w:rPr>
+          <w:i/>
+          <w:iCs/>
+        </w:rPr>
+        <w:t xml:space="preserve">(passed clean)</w:t>
+      </w:r>
+    </w:p>
+    <w:p>
+      <w:pPr>
+        <w:pStyle w:val="Compact"/>
+        <w:numPr>
+          <w:ilvl w:val="0"/>
+          <w:numId w:val="1003"/>
+        </w:numPr>
+      </w:pPr>
+      <w:r>
+        <w:rPr>
+          <w:b/>
+          <w:bCs/>
+        </w:rPr>
+        <w:t xml:space="preserve">synthetic-113</w:t>
+      </w:r>
+      <w:r>
+        <w:t xml:space="preserve"> </w:t>
+      </w:r>
+      <w:r>
+        <w:t xml:space="preserve">— Excel: sheets still named</w:t>
+      </w:r>
+      <w:r>
+        <w:t xml:space="preserve"> </w:t>
+      </w:r>
+      <w:r>
+        <w:t xml:space="preserve">‘Sheet1’</w:t>
+      </w:r>
+      <w:r>
+        <w:t xml:space="preserve"> </w:t>
+      </w:r>
+      <w:r>
+        <w:t xml:space="preserve">and</w:t>
+      </w:r>
+      <w:r>
+        <w:t xml:space="preserve"> </w:t>
+      </w:r>
+      <w:r>
+        <w:t xml:space="preserve">‘Sheet2’</w:t>
+      </w:r>
+      <w:r>
+        <w:t xml:space="preserve"> </w:t>
+      </w:r>
+      <w:r>
+        <w:rPr>
+          <w:i/>
+          <w:iCs/>
+        </w:rPr>
+        <w:t xml:space="preserve">(caught)</w:t>
+      </w:r>
+    </w:p>
+    <w:p>
+      <w:pPr>
+        <w:pStyle w:val="Compact"/>
+        <w:numPr>
+          <w:ilvl w:val="0"/>
+          <w:numId w:val="1003"/>
+        </w:numPr>
+      </w:pPr>
+      <w:r>
+        <w:rPr>
+          <w:b/>
+          <w:bCs/>
+        </w:rPr>
+        <w:t xml:space="preserve">synthetic-114</w:t>
+      </w:r>
+      <w:r>
+        <w:t xml:space="preserve"> </w:t>
+      </w:r>
+      <w:r>
+        <w:t xml:space="preserve">— Excel: the same workbook, sheets named for people</w:t>
+      </w:r>
+      <w:r>
+        <w:t xml:space="preserve"> </w:t>
+      </w:r>
+      <w:r>
+        <w:rPr>
+          <w:i/>
+          <w:iCs/>
+        </w:rPr>
+        <w:t xml:space="preserve">(passed clean)</w:t>
+      </w:r>
+    </w:p>
+    <w:p>
+      <w:pPr>
+        <w:pStyle w:val="Compact"/>
+        <w:numPr>
+          <w:ilvl w:val="0"/>
+          <w:numId w:val="1003"/>
+        </w:numPr>
+      </w:pPr>
+      <w:r>
+        <w:rPr>
+          <w:b/>
+          <w:bCs/>
+        </w:rPr>
+        <w:t xml:space="preserve">synthetic-115</w:t>
+      </w:r>
+      <w:r>
+        <w:t xml:space="preserve"> </w:t>
+      </w:r>
+      <w:r>
+        <w:t xml:space="preserve">— Excel: a workbook with no document title</w:t>
+      </w:r>
+      <w:r>
+        <w:t xml:space="preserve"> </w:t>
+      </w:r>
+      <w:r>
+        <w:rPr>
+          <w:i/>
+          <w:iCs/>
+        </w:rPr>
+        <w:t xml:space="preserve">(caught)</w:t>
+      </w:r>
+    </w:p>
+    <w:p>
+      <w:pPr>
+        <w:pStyle w:val="Compact"/>
+        <w:numPr>
+          <w:ilvl w:val="0"/>
+          <w:numId w:val="1003"/>
+        </w:numPr>
+      </w:pPr>
+      <w:r>
+        <w:rPr>
+          <w:b/>
+          <w:bCs/>
+        </w:rPr>
         <w:t xml:space="preserve">synthetic-116</w:t>
       </w:r>
       <w:r>
@@ -4919,504 +5417,6 @@
           <w:iCs/>
         </w:rPr>
         <w:t xml:space="preserve">(passed clean)</w:t>
-      </w:r>
-    </w:p>
-    <w:p>
-      <w:pPr>
-        <w:pStyle w:val="Compact"/>
-        <w:numPr>
-          <w:ilvl w:val="0"/>
-          <w:numId w:val="1003"/>
-        </w:numPr>
-      </w:pPr>
-      <w:r>
-        <w:rPr>
-          <w:b/>
-          <w:bCs/>
-        </w:rPr>
-        <w:t xml:space="preserve">synthetic-101</w:t>
-      </w:r>
-      <w:r>
-        <w:t xml:space="preserve"> </w:t>
-      </w:r>
-      <w:r>
-        <w:t xml:space="preserve">— Word: bold 16-point text instead of Heading styles</w:t>
-      </w:r>
-      <w:r>
-        <w:t xml:space="preserve"> </w:t>
-      </w:r>
-      <w:r>
-        <w:rPr>
-          <w:i/>
-          <w:iCs/>
-        </w:rPr>
-        <w:t xml:space="preserve">(caught)</w:t>
-      </w:r>
-    </w:p>
-    <w:p>
-      <w:pPr>
-        <w:pStyle w:val="Compact"/>
-        <w:numPr>
-          <w:ilvl w:val="0"/>
-          <w:numId w:val="1003"/>
-        </w:numPr>
-      </w:pPr>
-      <w:r>
-        <w:rPr>
-          <w:b/>
-          <w:bCs/>
-        </w:rPr>
-        <w:t xml:space="preserve">synthetic-102</w:t>
-      </w:r>
-      <w:r>
-        <w:t xml:space="preserve"> </w:t>
-      </w:r>
-      <w:r>
-        <w:t xml:space="preserve">— Word: the same document with real Heading styles</w:t>
-      </w:r>
-      <w:r>
-        <w:t xml:space="preserve"> </w:t>
-      </w:r>
-      <w:r>
-        <w:rPr>
-          <w:i/>
-          <w:iCs/>
-        </w:rPr>
-        <w:t xml:space="preserve">(passed clean)</w:t>
-      </w:r>
-    </w:p>
-    <w:p>
-      <w:pPr>
-        <w:pStyle w:val="Compact"/>
-        <w:numPr>
-          <w:ilvl w:val="0"/>
-          <w:numId w:val="1003"/>
-        </w:numPr>
-      </w:pPr>
-      <w:r>
-        <w:rPr>
-          <w:b/>
-          <w:bCs/>
-        </w:rPr>
-        <w:t xml:space="preserve">synthetic-103</w:t>
-      </w:r>
-      <w:r>
-        <w:t xml:space="preserve"> </w:t>
-      </w:r>
-      <w:r>
-        <w:t xml:space="preserve">— Word: two pictures, alt panel never opened</w:t>
-      </w:r>
-      <w:r>
-        <w:t xml:space="preserve"> </w:t>
-      </w:r>
-      <w:r>
-        <w:rPr>
-          <w:i/>
-          <w:iCs/>
-        </w:rPr>
-        <w:t xml:space="preserve">(caught)</w:t>
-      </w:r>
-    </w:p>
-    <w:p>
-      <w:pPr>
-        <w:pStyle w:val="Compact"/>
-        <w:numPr>
-          <w:ilvl w:val="0"/>
-          <w:numId w:val="1003"/>
-        </w:numPr>
-      </w:pPr>
-      <w:r>
-        <w:rPr>
-          <w:b/>
-          <w:bCs/>
-        </w:rPr>
-        <w:t xml:space="preserve">synthetic-104</w:t>
-      </w:r>
-      <w:r>
-        <w:t xml:space="preserve"> </w:t>
-      </w:r>
-      <w:r>
-        <w:t xml:space="preserve">— Word: the same pictures, both described</w:t>
-      </w:r>
-      <w:r>
-        <w:t xml:space="preserve"> </w:t>
-      </w:r>
-      <w:r>
-        <w:rPr>
-          <w:i/>
-          <w:iCs/>
-        </w:rPr>
-        <w:t xml:space="preserve">(passed clean)</w:t>
-      </w:r>
-    </w:p>
-    <w:p>
-      <w:pPr>
-        <w:pStyle w:val="Compact"/>
-        <w:numPr>
-          <w:ilvl w:val="0"/>
-          <w:numId w:val="1003"/>
-        </w:numPr>
-      </w:pPr>
-      <w:r>
-        <w:rPr>
-          <w:b/>
-          <w:bCs/>
-        </w:rPr>
-        <w:t xml:space="preserve">synthetic-105</w:t>
-      </w:r>
-      <w:r>
-        <w:t xml:space="preserve"> </w:t>
-      </w:r>
-      <w:r>
-        <w:t xml:space="preserve">— Word: a table whose header row was never marked</w:t>
-      </w:r>
-      <w:r>
-        <w:t xml:space="preserve"> </w:t>
-      </w:r>
-      <w:r>
-        <w:rPr>
-          <w:i/>
-          <w:iCs/>
-        </w:rPr>
-        <w:t xml:space="preserve">(caught)</w:t>
-      </w:r>
-    </w:p>
-    <w:p>
-      <w:pPr>
-        <w:pStyle w:val="Compact"/>
-        <w:numPr>
-          <w:ilvl w:val="0"/>
-          <w:numId w:val="1003"/>
-        </w:numPr>
-      </w:pPr>
-      <w:r>
-        <w:rPr>
-          <w:b/>
-          <w:bCs/>
-        </w:rPr>
-        <w:t xml:space="preserve">synthetic-106</w:t>
-      </w:r>
-      <w:r>
-        <w:t xml:space="preserve"> </w:t>
-      </w:r>
-      <w:r>
-        <w:t xml:space="preserve">— Word: the same table, header row marked</w:t>
-      </w:r>
-      <w:r>
-        <w:t xml:space="preserve"> </w:t>
-      </w:r>
-      <w:r>
-        <w:rPr>
-          <w:i/>
-          <w:iCs/>
-        </w:rPr>
-        <w:t xml:space="preserve">(passed clean)</w:t>
-      </w:r>
-    </w:p>
-    <w:p>
-      <w:pPr>
-        <w:pStyle w:val="Compact"/>
-        <w:numPr>
-          <w:ilvl w:val="0"/>
-          <w:numId w:val="1003"/>
-        </w:numPr>
-      </w:pPr>
-      <w:r>
-        <w:rPr>
-          <w:b/>
-          <w:bCs/>
-        </w:rPr>
-        <w:t xml:space="preserve">synthetic-107</w:t>
-      </w:r>
-      <w:r>
-        <w:t xml:space="preserve"> </w:t>
-      </w:r>
-      <w:r>
-        <w:t xml:space="preserve">— Word: no document title — readers hear the filename</w:t>
-      </w:r>
-      <w:r>
-        <w:t xml:space="preserve"> </w:t>
-      </w:r>
-      <w:r>
-        <w:rPr>
-          <w:i/>
-          <w:iCs/>
-        </w:rPr>
-        <w:t xml:space="preserve">(caught)</w:t>
-      </w:r>
-    </w:p>
-    <w:p>
-      <w:pPr>
-        <w:pStyle w:val="Compact"/>
-        <w:numPr>
-          <w:ilvl w:val="0"/>
-          <w:numId w:val="1003"/>
-        </w:numPr>
-      </w:pPr>
-      <w:r>
-        <w:rPr>
-          <w:b/>
-          <w:bCs/>
-        </w:rPr>
-        <w:t xml:space="preserve">synthetic-108</w:t>
-      </w:r>
-      <w:r>
-        <w:t xml:space="preserve"> </w:t>
-      </w:r>
-      <w:r>
-        <w:t xml:space="preserve">— Word: the same document, properly titled</w:t>
-      </w:r>
-      <w:r>
-        <w:t xml:space="preserve"> </w:t>
-      </w:r>
-      <w:r>
-        <w:rPr>
-          <w:i/>
-          <w:iCs/>
-        </w:rPr>
-        <w:t xml:space="preserve">(passed clean)</w:t>
-      </w:r>
-    </w:p>
-    <w:p>
-      <w:pPr>
-        <w:pStyle w:val="Compact"/>
-        <w:numPr>
-          <w:ilvl w:val="0"/>
-          <w:numId w:val="1003"/>
-        </w:numPr>
-      </w:pPr>
-      <w:r>
-        <w:rPr>
-          <w:b/>
-          <w:bCs/>
-        </w:rPr>
-        <w:t xml:space="preserve">synthetic-109</w:t>
-      </w:r>
-      <w:r>
-        <w:t xml:space="preserve"> </w:t>
-      </w:r>
-      <w:r>
-        <w:t xml:space="preserve">— PowerPoint: slides with no titles at all</w:t>
-      </w:r>
-      <w:r>
-        <w:t xml:space="preserve"> </w:t>
-      </w:r>
-      <w:r>
-        <w:rPr>
-          <w:i/>
-          <w:iCs/>
-        </w:rPr>
-        <w:t xml:space="preserve">(caught)</w:t>
-      </w:r>
-    </w:p>
-    <w:p>
-      <w:pPr>
-        <w:pStyle w:val="Compact"/>
-        <w:numPr>
-          <w:ilvl w:val="0"/>
-          <w:numId w:val="1003"/>
-        </w:numPr>
-      </w:pPr>
-      <w:r>
-        <w:rPr>
-          <w:b/>
-          <w:bCs/>
-        </w:rPr>
-        <w:t xml:space="preserve">synthetic-110</w:t>
-      </w:r>
-      <w:r>
-        <w:t xml:space="preserve"> </w:t>
-      </w:r>
-      <w:r>
-        <w:t xml:space="preserve">— PowerPoint: the same slides, properly titled</w:t>
-      </w:r>
-      <w:r>
-        <w:t xml:space="preserve"> </w:t>
-      </w:r>
-      <w:r>
-        <w:rPr>
-          <w:i/>
-          <w:iCs/>
-        </w:rPr>
-        <w:t xml:space="preserve">(passed clean)</w:t>
-      </w:r>
-    </w:p>
-    <w:p>
-      <w:pPr>
-        <w:pStyle w:val="Compact"/>
-        <w:numPr>
-          <w:ilvl w:val="0"/>
-          <w:numId w:val="1003"/>
-        </w:numPr>
-      </w:pPr>
-      <w:r>
-        <w:rPr>
-          <w:b/>
-          <w:bCs/>
-        </w:rPr>
-        <w:t xml:space="preserve">synthetic-111</w:t>
-      </w:r>
-      <w:r>
-        <w:t xml:space="preserve"> </w:t>
-      </w:r>
-      <w:r>
-        <w:t xml:space="preserve">— PowerPoint: a slide picture with no description</w:t>
-      </w:r>
-      <w:r>
-        <w:t xml:space="preserve"> </w:t>
-      </w:r>
-      <w:r>
-        <w:rPr>
-          <w:i/>
-          <w:iCs/>
-        </w:rPr>
-        <w:t xml:space="preserve">(caught)</w:t>
-      </w:r>
-    </w:p>
-    <w:p>
-      <w:pPr>
-        <w:pStyle w:val="Compact"/>
-        <w:numPr>
-          <w:ilvl w:val="0"/>
-          <w:numId w:val="1003"/>
-        </w:numPr>
-      </w:pPr>
-      <w:r>
-        <w:rPr>
-          <w:b/>
-          <w:bCs/>
-        </w:rPr>
-        <w:t xml:space="preserve">synthetic-112</w:t>
-      </w:r>
-      <w:r>
-        <w:t xml:space="preserve"> </w:t>
-      </w:r>
-      <w:r>
-        <w:t xml:space="preserve">— PowerPoint: the same picture, described</w:t>
-      </w:r>
-      <w:r>
-        <w:t xml:space="preserve"> </w:t>
-      </w:r>
-      <w:r>
-        <w:rPr>
-          <w:i/>
-          <w:iCs/>
-        </w:rPr>
-        <w:t xml:space="preserve">(passed clean)</w:t>
-      </w:r>
-    </w:p>
-    <w:p>
-      <w:pPr>
-        <w:pStyle w:val="Compact"/>
-        <w:numPr>
-          <w:ilvl w:val="0"/>
-          <w:numId w:val="1003"/>
-        </w:numPr>
-      </w:pPr>
-      <w:r>
-        <w:rPr>
-          <w:b/>
-          <w:bCs/>
-        </w:rPr>
-        <w:t xml:space="preserve">synthetic-113</w:t>
-      </w:r>
-      <w:r>
-        <w:t xml:space="preserve"> </w:t>
-      </w:r>
-      <w:r>
-        <w:t xml:space="preserve">— Excel: sheets still named</w:t>
-      </w:r>
-      <w:r>
-        <w:t xml:space="preserve"> </w:t>
-      </w:r>
-      <w:r>
-        <w:t xml:space="preserve">‘Sheet1’</w:t>
-      </w:r>
-      <w:r>
-        <w:t xml:space="preserve"> </w:t>
-      </w:r>
-      <w:r>
-        <w:t xml:space="preserve">and</w:t>
-      </w:r>
-      <w:r>
-        <w:t xml:space="preserve"> </w:t>
-      </w:r>
-      <w:r>
-        <w:t xml:space="preserve">‘Sheet2’</w:t>
-      </w:r>
-      <w:r>
-        <w:t xml:space="preserve"> </w:t>
-      </w:r>
-      <w:r>
-        <w:rPr>
-          <w:i/>
-          <w:iCs/>
-        </w:rPr>
-        <w:t xml:space="preserve">(caught)</w:t>
-      </w:r>
-    </w:p>
-    <w:p>
-      <w:pPr>
-        <w:pStyle w:val="Compact"/>
-        <w:numPr>
-          <w:ilvl w:val="0"/>
-          <w:numId w:val="1003"/>
-        </w:numPr>
-      </w:pPr>
-      <w:r>
-        <w:rPr>
-          <w:b/>
-          <w:bCs/>
-        </w:rPr>
-        <w:t xml:space="preserve">synthetic-114</w:t>
-      </w:r>
-      <w:r>
-        <w:t xml:space="preserve"> </w:t>
-      </w:r>
-      <w:r>
-        <w:t xml:space="preserve">— Excel: the same workbook, sheets named for people</w:t>
-      </w:r>
-      <w:r>
-        <w:t xml:space="preserve"> </w:t>
-      </w:r>
-      <w:r>
-        <w:rPr>
-          <w:i/>
-          <w:iCs/>
-        </w:rPr>
-        <w:t xml:space="preserve">(passed clean)</w:t>
-      </w:r>
-    </w:p>
-    <w:p>
-      <w:pPr>
-        <w:pStyle w:val="Compact"/>
-        <w:numPr>
-          <w:ilvl w:val="0"/>
-          <w:numId w:val="1003"/>
-        </w:numPr>
-      </w:pPr>
-      <w:r>
-        <w:rPr>
-          <w:b/>
-          <w:bCs/>
-        </w:rPr>
-        <w:t xml:space="preserve">synthetic-115</w:t>
-      </w:r>
-      <w:r>
-        <w:t xml:space="preserve"> </w:t>
-      </w:r>
-      <w:r>
-        <w:t xml:space="preserve">— Excel: a workbook with no document title</w:t>
-      </w:r>
-      <w:r>
-        <w:t xml:space="preserve"> </w:t>
-      </w:r>
-      <w:r>
-        <w:rPr>
-          <w:i/>
-          <w:iCs/>
-        </w:rPr>
-        <w:t xml:space="preserve">(caught)</w:t>
       </w:r>
     </w:p>
     <w:bookmarkEnd w:id="22"/>

</xml_diff>

<commit_message>
release: v1.140.1 — the optional tier reads as a section, not a footnote
USER: 'Please make this bigger — more infographic-ish — so it's hard
to miss. (i.e., the actual fixes are above — and here are the extra
fixes if you want them).'

- A full-width seam divider between the tiers: 'Everything the law
  requires is above ↑' — a reader scrolling past the plan cannot
  mistake what follows for more obligations.
- Headline-scale title + larger badge inside a heavier sky-bordered
  card (rounded-2xl, border-2).
- At-a-glance stat chips lead the section: '0 of these count toward
  your score' · 'N optional items from this report' · 'veraPDF: 4,732
  occurrences · 8 rules' (or ✓ on a clean pass).

Presentation only: every copy string earlier tests pin is unchanged
('Above and beyond — not required by WCAG 2.1', 'BEST PRACTICE — NOT
SCORED'). Tests 3,007 -> 3,008. Versions x6, CHANGELOG, README, §10.
</commit_message>
<xml_diff>
--- a/docs/brief/checker-brief.docx
+++ b/docs/brief/checker-brief.docx
@@ -50,23 +50,23 @@
           <w:b/>
           <w:bCs/>
         </w:rPr>
-        <w:t xml:space="preserve">12,348</w:t>
-      </w:r>
-      <w:r>
-        <w:t xml:space="preserve"> </w:t>
-      </w:r>
-      <w:r>
-        <w:t xml:space="preserve">check-ups run for internal and external agencies — the quick per-file check-up that has caught on beyond ICJIA: easier than SiteImprove, clearer than PAC. 8,238 in the last 30 days alone. ·</w:t>
-      </w:r>
-      <w:r>
-        <w:t xml:space="preserve"> </w:t>
-      </w:r>
-      <w:r>
-        <w:rPr>
-          <w:b/>
-          <w:bCs/>
-        </w:rPr>
-        <w:t xml:space="preserve">3,007</w:t>
+        <w:t xml:space="preserve">12,353</w:t>
+      </w:r>
+      <w:r>
+        <w:t xml:space="preserve"> </w:t>
+      </w:r>
+      <w:r>
+        <w:t xml:space="preserve">check-ups run for internal and external agencies — the quick per-file check-up that has caught on beyond ICJIA: easier than SiteImprove, clearer than PAC. 8,243 in the last 30 days alone. ·</w:t>
+      </w:r>
+      <w:r>
+        <w:t xml:space="preserve"> </w:t>
+      </w:r>
+      <w:r>
+        <w:rPr>
+          <w:b/>
+          <w:bCs/>
+        </w:rPr>
+        <w:t xml:space="preserve">3,008</w:t>
       </w:r>
       <w:r>
         <w:t xml:space="preserve"> </w:t>
@@ -98,7 +98,7 @@
           <w:b/>
           <w:bCs/>
         </w:rPr>
-        <w:t xml:space="preserve">718</w:t>
+        <w:t xml:space="preserve">719</w:t>
       </w:r>
       <w:r>
         <w:t xml:space="preserve"> </w:t>
@@ -863,7 +863,7 @@
         <w:pStyle w:val="FirstParagraph"/>
       </w:pPr>
       <w:r>
-        <w:t xml:space="preserve">Twelve gates stand between a code change and the live site, run automatically on every change; one failure stops the release cold. On every change: the 3,007 self-checks (every promise ever made, re-tested); the 124 trap documents rebuilt and re-judged; the scoring invariant (the grade shown must always match the score computed); the</w:t>
+        <w:t xml:space="preserve">Twelve gates stand between a code change and the live site, run automatically on every change; one failure stops the release cold. On every change: the 3,008 self-checks (every promise ever made, re-tested); the 124 trap documents rebuilt and re-judged; the scoring invariant (the grade shown must always match the score computed); the</w:t>
       </w:r>
       <w:r>
         <w:t xml:space="preserve"> </w:t>
@@ -1089,13 +1089,13 @@
       </w:r>
     </w:p>
     <w:bookmarkEnd w:id="17"/>
-    <w:bookmarkStart w:id="20" w:name="six-months.-718-changes.-140-versions."/>
+    <w:bookmarkStart w:id="20" w:name="six-months.-719-changes.-140-versions."/>
     <w:p>
       <w:pPr>
         <w:pStyle w:val="Heading2"/>
       </w:pPr>
       <w:r>
-        <w:t xml:space="preserve">Six months. 718 changes. 140 versions.</w:t>
+        <w:t xml:space="preserve">Six months. 719 changes. 140 versions.</w:t>
       </w:r>
     </w:p>
     <w:p>
@@ -1103,7 +1103,7 @@
         <w:pStyle w:val="FirstParagraph"/>
       </w:pPr>
       <w:r>
-        <w:t xml:space="preserve">Not a weekend project. Since March it has grown from a single PDF check into a checker for four kinds of files — 278 saved changes in the last 30 days alone, its battery of self-checks grown from about 1,500 in June to 3,007 today. All of it is public, on GitHub:</w:t>
+        <w:t xml:space="preserve">Not a weekend project. Since March it has grown from a single PDF check into a checker for four kinds of files — 279 saved changes in the last 30 days alone, its battery of self-checks grown from about 1,500 in June to 3,008 today. All of it is public, on GitHub:</w:t>
       </w:r>
       <w:r>
         <w:t xml:space="preserve"> </w:t>
@@ -1178,7 +1178,7 @@
         <w:t xml:space="preserve"> </w:t>
       </w:r>
       <w:r>
-        <w:t xml:space="preserve">This is real software, battle-tested: 12,348 check-ups for internal and external agencies, 124 trap documents designed to fool it, an independent referee co-signing every report, and a public record of every change — and it is free. Nothing here asks for trust; every claim here is checkable by anyone:</w:t>
+        <w:t xml:space="preserve">This is real software, battle-tested: 12,353 check-ups for internal and external agencies, 124 trap documents designed to fool it, an independent referee co-signing every report, and a public record of every change — and it is free. Nothing here asks for trust; every claim here is checkable by anyone:</w:t>
       </w:r>
     </w:p>
     <w:p>
@@ -1238,13 +1238,13 @@
           <w:b/>
           <w:bCs/>
         </w:rPr>
-        <w:t xml:space="preserve">3,007 self-checks.</w:t>
-      </w:r>
-      <w:r>
-        <w:t xml:space="preserve"> </w:t>
-      </w:r>
-      <w:r>
-        <w:t xml:space="preserve">Before anything new goes live, the software re-runs every promise it has ever made — all 3,007 must pass. A single failure stops the release cold: fix it, then run the full battery again from the top. A few of those promises, in plain words: a scanned page with no readable text must score zero (no partial credit for a picture of words); a file with no tables must never be graded on tables; the grade on screen and the grade in the downloaded report must match, digit for digit; an image description made of nothing but blank spaces must be caught as empty; a re-saved copy of a document must receive the identical grade, digit for digit; and all 124 trap documents must still be judged correctly, every release.</w:t>
+        <w:t xml:space="preserve">3,008 self-checks.</w:t>
+      </w:r>
+      <w:r>
+        <w:t xml:space="preserve"> </w:t>
+      </w:r>
+      <w:r>
+        <w:t xml:space="preserve">Before anything new goes live, the software re-runs every promise it has ever made — all 3,008 must pass. A single failure stops the release cold: fix it, then run the full battery again from the top. A few of those promises, in plain words: a scanned page with no readable text must score zero (no partial credit for a picture of words); a file with no tables must never be graded on tables; the grade on screen and the grade in the downloaded report must match, digit for digit; an image description made of nothing but blank spaces must be caught as empty; a re-saved copy of a document must receive the identical grade, digit for digit; and all 124 trap documents must still be judged correctly, every release.</w:t>
       </w:r>
     </w:p>
     <w:p>

</xml_diff>

<commit_message>
release: v1.141.1 — 'in 1 category'
Caught live on the Elderabuse2 remediation report while verifying the
new strips: '2 criteria failing in 1 categories' — the
criteria↔categories bridge never singularized its noun. On a product
hunting copy errors, grammar is copy. Fixed; pinned both ways
('in 1 category' required, '1 categories' forbidden).

Tests 3,010 -> 3,011. Versions x6, CHANGELOG, README, §10.
</commit_message>
<xml_diff>
--- a/docs/brief/checker-brief.docx
+++ b/docs/brief/checker-brief.docx
@@ -50,23 +50,23 @@
           <w:b/>
           <w:bCs/>
         </w:rPr>
-        <w:t xml:space="preserve">12,355</w:t>
-      </w:r>
-      <w:r>
-        <w:t xml:space="preserve"> </w:t>
-      </w:r>
-      <w:r>
-        <w:t xml:space="preserve">check-ups run for internal and external agencies — the quick per-file check-up that has caught on beyond ICJIA: easier than SiteImprove, clearer than PAC. 8,245 in the last 30 days alone. ·</w:t>
-      </w:r>
-      <w:r>
-        <w:t xml:space="preserve"> </w:t>
-      </w:r>
-      <w:r>
-        <w:rPr>
-          <w:b/>
-          <w:bCs/>
-        </w:rPr>
-        <w:t xml:space="preserve">3,010</w:t>
+        <w:t xml:space="preserve">12,358</w:t>
+      </w:r>
+      <w:r>
+        <w:t xml:space="preserve"> </w:t>
+      </w:r>
+      <w:r>
+        <w:t xml:space="preserve">check-ups run for internal and external agencies — the quick per-file check-up that has caught on beyond ICJIA: easier than SiteImprove, clearer than PAC. 8,248 in the last 30 days alone. ·</w:t>
+      </w:r>
+      <w:r>
+        <w:t xml:space="preserve"> </w:t>
+      </w:r>
+      <w:r>
+        <w:rPr>
+          <w:b/>
+          <w:bCs/>
+        </w:rPr>
+        <w:t xml:space="preserve">3,011</w:t>
       </w:r>
       <w:r>
         <w:t xml:space="preserve"> </w:t>
@@ -98,7 +98,7 @@
           <w:b/>
           <w:bCs/>
         </w:rPr>
-        <w:t xml:space="preserve">720</w:t>
+        <w:t xml:space="preserve">721</w:t>
       </w:r>
       <w:r>
         <w:t xml:space="preserve"> </w:t>
@@ -863,7 +863,7 @@
         <w:pStyle w:val="FirstParagraph"/>
       </w:pPr>
       <w:r>
-        <w:t xml:space="preserve">Twelve gates stand between a code change and the live site, run automatically on every change; one failure stops the release cold. On every change: the 3,010 self-checks (every promise ever made, re-tested); the 124 trap documents rebuilt and re-judged; the scoring invariant (the grade shown must always match the score computed); the</w:t>
+        <w:t xml:space="preserve">Twelve gates stand between a code change and the live site, run automatically on every change; one failure stops the release cold. On every change: the 3,011 self-checks (every promise ever made, re-tested); the 124 trap documents rebuilt and re-judged; the scoring invariant (the grade shown must always match the score computed); the</w:t>
       </w:r>
       <w:r>
         <w:t xml:space="preserve"> </w:t>
@@ -1089,13 +1089,13 @@
       </w:r>
     </w:p>
     <w:bookmarkEnd w:id="17"/>
-    <w:bookmarkStart w:id="20" w:name="six-months.-720-changes.-141-versions."/>
+    <w:bookmarkStart w:id="20" w:name="six-months.-721-changes.-141-versions."/>
     <w:p>
       <w:pPr>
         <w:pStyle w:val="Heading2"/>
       </w:pPr>
       <w:r>
-        <w:t xml:space="preserve">Six months. 720 changes. 141 versions.</w:t>
+        <w:t xml:space="preserve">Six months. 721 changes. 141 versions.</w:t>
       </w:r>
     </w:p>
     <w:p>
@@ -1103,7 +1103,7 @@
         <w:pStyle w:val="FirstParagraph"/>
       </w:pPr>
       <w:r>
-        <w:t xml:space="preserve">Not a weekend project. Since March it has grown from a single PDF check into a checker for four kinds of files — 280 saved changes in the last 30 days alone, its battery of self-checks grown from about 1,500 in June to 3,010 today. All of it is public, on GitHub:</w:t>
+        <w:t xml:space="preserve">Not a weekend project. Since March it has grown from a single PDF check into a checker for four kinds of files — 281 saved changes in the last 30 days alone, its battery of self-checks grown from about 1,500 in June to 3,011 today. All of it is public, on GitHub:</w:t>
       </w:r>
       <w:r>
         <w:t xml:space="preserve"> </w:t>
@@ -1178,7 +1178,7 @@
         <w:t xml:space="preserve"> </w:t>
       </w:r>
       <w:r>
-        <w:t xml:space="preserve">This is real software, battle-tested: 12,355 check-ups for internal and external agencies, 124 trap documents designed to fool it, an independent referee co-signing every report, and a public record of every change — and it is free. Nothing here asks for trust; every claim here is checkable by anyone:</w:t>
+        <w:t xml:space="preserve">This is real software, battle-tested: 12,358 check-ups for internal and external agencies, 124 trap documents designed to fool it, an independent referee co-signing every report, and a public record of every change — and it is free. Nothing here asks for trust; every claim here is checkable by anyone:</w:t>
       </w:r>
     </w:p>
     <w:p>
@@ -1238,13 +1238,13 @@
           <w:b/>
           <w:bCs/>
         </w:rPr>
-        <w:t xml:space="preserve">3,010 self-checks.</w:t>
-      </w:r>
-      <w:r>
-        <w:t xml:space="preserve"> </w:t>
-      </w:r>
-      <w:r>
-        <w:t xml:space="preserve">Before anything new goes live, the software re-runs every promise it has ever made — all 3,010 must pass. A single failure stops the release cold: fix it, then run the full battery again from the top. A few of those promises, in plain words: a scanned page with no readable text must score zero (no partial credit for a picture of words); a file with no tables must never be graded on tables; the grade on screen and the grade in the downloaded report must match, digit for digit; an image description made of nothing but blank spaces must be caught as empty; a re-saved copy of a document must receive the identical grade, digit for digit; and all 124 trap documents must still be judged correctly, every release.</w:t>
+        <w:t xml:space="preserve">3,011 self-checks.</w:t>
+      </w:r>
+      <w:r>
+        <w:t xml:space="preserve"> </w:t>
+      </w:r>
+      <w:r>
+        <w:t xml:space="preserve">Before anything new goes live, the software re-runs every promise it has ever made — all 3,011 must pass. A single failure stops the release cold: fix it, then run the full battery again from the top. A few of those promises, in plain words: a scanned page with no readable text must score zero (no partial credit for a picture of words); a file with no tables must never be graded on tables; the grade on screen and the grade in the downloaded report must match, digit for digit; an image description made of nothing but blank spaces must be caught as empty; a re-saved copy of a document must receive the identical grade, digit for digit; and all 124 trap documents must still be judged correctly, every release.</w:t>
       </w:r>
     </w:p>
     <w:p>

</xml_diff>

<commit_message>
release: v1.141.3 — the last staled bug-count, and the guard that catches its class
The residual live-page match after v1.141.2: the ORIGINAL trap-battery
announcement (dated 2026-08-28; announcement strings ride the app
bundle onto every page) said 'passed all eighteen — after the battery
caught one real bug.' Now historically qualified and countless:
'passed all eighteen then in the battery — after it caught the first
of its own bugs.'

Guard extended (AnnouncementBanner.test): word-number status claims
('passed all eighteen') and any 'one real bug' phrasing now fail the
suite alongside digit totals. Writing it caught its own regex
backtracking hole — \w+ matched 'eightee' to dodge the negative
lookahead; a \b closes it.

Tests 3,011. Versions x6, CHANGELOG, README, §10.
</commit_message>
<xml_diff>
--- a/docs/brief/checker-brief.docx
+++ b/docs/brief/checker-brief.docx
@@ -50,13 +50,13 @@
           <w:b/>
           <w:bCs/>
         </w:rPr>
-        <w:t xml:space="preserve">12,361</w:t>
-      </w:r>
-      <w:r>
-        <w:t xml:space="preserve"> </w:t>
-      </w:r>
-      <w:r>
-        <w:t xml:space="preserve">check-ups run for internal and external agencies — the quick per-file check-up that has caught on beyond ICJIA: easier than SiteImprove, clearer than PAC. 8,251 in the last 30 days alone. ·</w:t>
+        <w:t xml:space="preserve">12,365</w:t>
+      </w:r>
+      <w:r>
+        <w:t xml:space="preserve"> </w:t>
+      </w:r>
+      <w:r>
+        <w:t xml:space="preserve">check-ups run for internal and external agencies — the quick per-file check-up that has caught on beyond ICJIA: easier than SiteImprove, clearer than PAC. 8,255 in the last 30 days alone. ·</w:t>
       </w:r>
       <w:r>
         <w:t xml:space="preserve"> </w:t>
@@ -98,7 +98,7 @@
           <w:b/>
           <w:bCs/>
         </w:rPr>
-        <w:t xml:space="preserve">722</w:t>
+        <w:t xml:space="preserve">723</w:t>
       </w:r>
       <w:r>
         <w:t xml:space="preserve"> </w:t>
@@ -1089,13 +1089,13 @@
       </w:r>
     </w:p>
     <w:bookmarkEnd w:id="17"/>
-    <w:bookmarkStart w:id="20" w:name="six-months.-722-changes.-141-versions."/>
+    <w:bookmarkStart w:id="20" w:name="six-months.-723-changes.-141-versions."/>
     <w:p>
       <w:pPr>
         <w:pStyle w:val="Heading2"/>
       </w:pPr>
       <w:r>
-        <w:t xml:space="preserve">Six months. 722 changes. 141 versions.</w:t>
+        <w:t xml:space="preserve">Six months. 723 changes. 141 versions.</w:t>
       </w:r>
     </w:p>
     <w:p>
@@ -1103,7 +1103,7 @@
         <w:pStyle w:val="FirstParagraph"/>
       </w:pPr>
       <w:r>
-        <w:t xml:space="preserve">Not a weekend project. Since March it has grown from a single PDF check into a checker for four kinds of files — 282 saved changes in the last 30 days alone, its battery of self-checks grown from about 1,500 in June to 3,011 today. All of it is public, on GitHub:</w:t>
+        <w:t xml:space="preserve">Not a weekend project. Since March it has grown from a single PDF check into a checker for four kinds of files — 283 saved changes in the last 30 days alone, its battery of self-checks grown from about 1,500 in June to 3,011 today. All of it is public, on GitHub:</w:t>
       </w:r>
       <w:r>
         <w:t xml:space="preserve"> </w:t>
@@ -1178,7 +1178,7 @@
         <w:t xml:space="preserve"> </w:t>
       </w:r>
       <w:r>
-        <w:t xml:space="preserve">This is real software, battle-tested: 12,361 check-ups for internal and external agencies, 124 trap documents designed to fool it, an independent referee co-signing every report, and a public record of every change — and it is free. Nothing here asks for trust; every claim here is checkable by anyone:</w:t>
+        <w:t xml:space="preserve">This is real software, battle-tested: 12,365 check-ups for internal and external agencies, 124 trap documents designed to fool it, an independent referee co-signing every report, and a public record of every change — and it is free. Nothing here asks for trust; every claim here is checkable by anyone:</w:t>
       </w:r>
     </w:p>
     <w:p>

</xml_diff>

<commit_message>
fix(report): close the five gaps the review found, before the verdict
single-h1 now carries the heading tree — the user's own example
(h1->h2->h1->h1) has no level gap, so heading-level-order reads MET and
this is the row that flags it; the sequence belongs beside its sentence.
Word heading practices now surface the heading outline the analyzer
already emits (H1 "Introduction" / H3 "Findings"); it was read by nothing.
Category helpLinks — spec §4's third link source — reach every row through
one resolver shared by screen and paper, so the two cannot drift.
evaluateBestPractices wraps each detect() as spec §2 required; a throw is
one grey row, not a 500 on the shared-report page.
nested-tables' MET sentence claims only what the analyzer measured: it
counts nesting over data tables and skips single-column layout tables.
Counts refreshed from a real run (3,334); brief rebuilt.
</commit_message>
<xml_diff>
--- a/docs/brief/checker-brief.docx
+++ b/docs/brief/checker-brief.docx
@@ -66,7 +66,7 @@
           <w:b/>
           <w:bCs/>
         </w:rPr>
-        <w:t xml:space="preserve">3,324</w:t>
+        <w:t xml:space="preserve">3,334</w:t>
       </w:r>
       <w:r>
         <w:t xml:space="preserve"> </w:t>
@@ -98,7 +98,7 @@
           <w:b/>
           <w:bCs/>
         </w:rPr>
-        <w:t xml:space="preserve">778</w:t>
+        <w:t xml:space="preserve">780</w:t>
       </w:r>
       <w:r>
         <w:t xml:space="preserve"> </w:t>
@@ -863,7 +863,7 @@
         <w:pStyle w:val="FirstParagraph"/>
       </w:pPr>
       <w:r>
-        <w:t xml:space="preserve">Twelve gates stand between a code change and the live site, run automatically on every change; one failure stops the release cold. On every change: the 3,324 self-checks (every promise ever made, re-tested); the 127 trap documents rebuilt and re-judged; the scoring invariant (the grade shown must always match the score computed); the</w:t>
+        <w:t xml:space="preserve">Twelve gates stand between a code change and the live site, run automatically on every change; one failure stops the release cold. On every change: the 3,334 self-checks (every promise ever made, re-tested); the 127 trap documents rebuilt and re-judged; the scoring invariant (the grade shown must always match the score computed); the</w:t>
       </w:r>
       <w:r>
         <w:t xml:space="preserve"> </w:t>
@@ -1089,13 +1089,13 @@
       </w:r>
     </w:p>
     <w:bookmarkEnd w:id="17"/>
-    <w:bookmarkStart w:id="20" w:name="six-months.-778-changes.-143-versions."/>
+    <w:bookmarkStart w:id="20" w:name="six-months.-780-changes.-143-versions."/>
     <w:p>
       <w:pPr>
         <w:pStyle w:val="Heading2"/>
       </w:pPr>
       <w:r>
-        <w:t xml:space="preserve">Six months. 778 changes. 143 versions.</w:t>
+        <w:t xml:space="preserve">Six months. 780 changes. 143 versions.</w:t>
       </w:r>
     </w:p>
     <w:p>
@@ -1103,7 +1103,7 @@
         <w:pStyle w:val="FirstParagraph"/>
       </w:pPr>
       <w:r>
-        <w:t xml:space="preserve">Not a weekend project. Since March it has grown from a single PDF check into a checker for four kinds of files — 338 saved changes in the last 30 days alone, its battery of self-checks grown from about 1,500 in June to 3,324 today. All of it is public, on GitHub:</w:t>
+        <w:t xml:space="preserve">Not a weekend project. Since March it has grown from a single PDF check into a checker for four kinds of files — 340 saved changes in the last 30 days alone, its battery of self-checks grown from about 1,500 in June to 3,334 today. All of it is public, on GitHub:</w:t>
       </w:r>
       <w:r>
         <w:t xml:space="preserve"> </w:t>
@@ -1238,13 +1238,13 @@
           <w:b/>
           <w:bCs/>
         </w:rPr>
-        <w:t xml:space="preserve">3,324 self-checks.</w:t>
-      </w:r>
-      <w:r>
-        <w:t xml:space="preserve"> </w:t>
-      </w:r>
-      <w:r>
-        <w:t xml:space="preserve">Before anything new goes live, the software re-runs every promise it has ever made — all 3,324 must pass. A single failure stops the release cold: fix it, then run the full battery again from the top. A few of those promises, in plain words: a scanned page with no readable text must score zero (no partial credit for a picture of words); a file with no tables must never be graded on tables; the grade on screen and the grade in the downloaded report must match, digit for digit; an image description made of nothing but blank spaces must be caught as empty; a re-saved copy of a document must receive the identical grade, digit for digit; and all 127 trap documents must still be judged correctly, every release.</w:t>
+        <w:t xml:space="preserve">3,334 self-checks.</w:t>
+      </w:r>
+      <w:r>
+        <w:t xml:space="preserve"> </w:t>
+      </w:r>
+      <w:r>
+        <w:t xml:space="preserve">Before anything new goes live, the software re-runs every promise it has ever made — all 3,334 must pass. A single failure stops the release cold: fix it, then run the full battery again from the top. A few of those promises, in plain words: a scanned page with no readable text must score zero (no partial credit for a picture of words); a file with no tables must never be graded on tables; the grade on screen and the grade in the downloaded report must match, digit for digit; an image description made of nothing but blank spaces must be caught as empty; a re-saved copy of a document must receive the identical grade, digit for digit; and all 127 trap documents must still be judged correctly, every release.</w:t>
       </w:r>
     </w:p>
     <w:p>

</xml_diff>

<commit_message>
build: stop copying the brief into ~/Downloads
Every build-brief run wrote checker-brief.{html,docx} into the user's home
directory and silently overwrote whatever was there. Nothing depended on it —
it was a convenience for grabbing the .docx to email — and writing outside the
project on every release is a side effect a build step should not have.

The three outputs that matter are unchanged: docs/brief/checker-brief.html
(committed, and the source for the published artifact), the .docx beside it,
and apps/web/app/data/trustBody.ts, which is what /trust renders — the same
template and the same fill, with a test that fails the build if the page and
the brief ever diverge.
</commit_message>
<xml_diff>
--- a/docs/brief/checker-brief.docx
+++ b/docs/brief/checker-brief.docx
@@ -98,7 +98,7 @@
           <w:b/>
           <w:bCs/>
         </w:rPr>
-        <w:t xml:space="preserve">826</w:t>
+        <w:t xml:space="preserve">827</w:t>
       </w:r>
       <w:r>
         <w:t xml:space="preserve"> </w:t>
@@ -1108,13 +1108,13 @@
       </w:r>
     </w:p>
     <w:bookmarkEnd w:id="17"/>
-    <w:bookmarkStart w:id="20" w:name="six-months.-826-changes.-150-versions."/>
+    <w:bookmarkStart w:id="20" w:name="six-months.-827-changes.-150-versions."/>
     <w:p>
       <w:pPr>
         <w:pStyle w:val="Heading2"/>
       </w:pPr>
       <w:r>
-        <w:t xml:space="preserve">Six months. 826 changes. 150 versions.</w:t>
+        <w:t xml:space="preserve">Six months. 827 changes. 150 versions.</w:t>
       </w:r>
     </w:p>
     <w:p>
@@ -1122,7 +1122,7 @@
         <w:pStyle w:val="FirstParagraph"/>
       </w:pPr>
       <w:r>
-        <w:t xml:space="preserve">Not a weekend project. Since March it has grown from a single PDF check into a checker for four kinds of files — 386 saved changes in the last 30 days alone, its battery of self-checks grown from about 1,500 in June to 3,427 today. All of it is public, on GitHub:</w:t>
+        <w:t xml:space="preserve">Not a weekend project. Since March it has grown from a single PDF check into a checker for four kinds of files — 387 saved changes in the last 30 days alone, its battery of self-checks grown from about 1,500 in June to 3,427 today. All of it is public, on GitHub:</w:t>
       </w:r>
       <w:r>
         <w:t xml:space="preserve"> </w:t>

</xml_diff>

<commit_message>
release: v1.153.0 — the fresh-eyes audit named, DisplayDocTitle scored, docs current
CHANGELOG entry covering the audit's fix sweep (deployed unversioned
under 1.152.0), the queued follow-ups, and the documentation sweep.
Versions x6, README §Security + data-retention §10 entries (the two-day
security review recorded: no finding at reportable confidence), Scoring
announcement banner, brief regenerated (tests 3,531 · traps 153 ·
v-count 153; docx verified free of field codes).
</commit_message>
<xml_diff>
--- a/docs/brief/checker-brief.docx
+++ b/docs/brief/checker-brief.docx
@@ -50,13 +50,13 @@
           <w:b/>
           <w:bCs/>
         </w:rPr>
-        <w:t xml:space="preserve">12,455</w:t>
-      </w:r>
-      <w:r>
-        <w:t xml:space="preserve"> </w:t>
-      </w:r>
-      <w:r>
-        <w:t xml:space="preserve">check-ups run for internal and external agencies — the quick per-file check-up that has caught on beyond ICJIA: easier than SiteImprove, clearer than PAC. 8,341 in the last 30 days alone. ·</w:t>
+        <w:t xml:space="preserve">12,457</w:t>
+      </w:r>
+      <w:r>
+        <w:t xml:space="preserve"> </w:t>
+      </w:r>
+      <w:r>
+        <w:t xml:space="preserve">check-ups run for internal and external agencies — the quick per-file check-up that has caught on beyond ICJIA: easier than SiteImprove, clearer than PAC. 8,343 in the last 30 days alone. ·</w:t>
       </w:r>
       <w:r>
         <w:t xml:space="preserve"> </w:t>
@@ -98,7 +98,7 @@
           <w:b/>
           <w:bCs/>
         </w:rPr>
-        <w:t xml:space="preserve">845</w:t>
+        <w:t xml:space="preserve">846</w:t>
       </w:r>
       <w:r>
         <w:t xml:space="preserve"> </w:t>
@@ -1108,13 +1108,13 @@
       </w:r>
     </w:p>
     <w:bookmarkEnd w:id="17"/>
-    <w:bookmarkStart w:id="20" w:name="six-months.-845-changes.-152-versions."/>
+    <w:bookmarkStart w:id="20" w:name="six-months.-846-changes.-153-versions."/>
     <w:p>
       <w:pPr>
         <w:pStyle w:val="Heading2"/>
       </w:pPr>
       <w:r>
-        <w:t xml:space="preserve">Six months. 845 changes. 152 versions.</w:t>
+        <w:t xml:space="preserve">Six months. 846 changes. 153 versions.</w:t>
       </w:r>
     </w:p>
     <w:p>
@@ -1122,7 +1122,7 @@
         <w:pStyle w:val="FirstParagraph"/>
       </w:pPr>
       <w:r>
-        <w:t xml:space="preserve">Not a weekend project. Since March it has grown from a single PDF check into a checker for four kinds of files — 405 saved changes in the last 30 days alone, its battery of self-checks grown from about 1,500 in June to 3,531 today. All of it is public, on GitHub:</w:t>
+        <w:t xml:space="preserve">Not a weekend project. Since March it has grown from a single PDF check into a checker for four kinds of files — 406 saved changes in the last 30 days alone, its battery of self-checks grown from about 1,500 in June to 3,531 today. All of it is public, on GitHub:</w:t>
       </w:r>
       <w:r>
         <w:t xml:space="preserve"> </w:t>
@@ -1197,7 +1197,7 @@
         <w:t xml:space="preserve"> </w:t>
       </w:r>
       <w:r>
-        <w:t xml:space="preserve">This is real software, battle-tested: 12,455 check-ups for internal and external agencies, 153 trap documents designed to fool it, an independent referee co-signing every report, and a public record of every change — and it is free. Nothing here asks for trust; every claim here is checkable by anyone:</w:t>
+        <w:t xml:space="preserve">This is real software, battle-tested: 12,457 check-ups for internal and external agencies, 153 trap documents designed to fool it, an independent referee co-signing every report, and a public record of every change — and it is free. Nothing here asks for trust; every claim here is checkable by anyone:</w:t>
       </w:r>
     </w:p>
     <w:p>
@@ -1285,7 +1285,7 @@
         <w:t xml:space="preserve"> </w:t>
       </w:r>
       <w:r>
-        <w:t xml:space="preserve">152 version notes plus a plain-language security log written for records auditors — mistakes included.</w:t>
+        <w:t xml:space="preserve">153 version notes plus a plain-language security log written for records auditors — mistakes included.</w:t>
       </w:r>
     </w:p>
     <w:p>

</xml_diff>

<commit_message>
release: v1.154.0 — the plan tells you the price in minutes, and the price is honest
Fix-time estimates ship on every action-plan surface (b8b34f2). Release
paperwork in lockstep: CHANGELOG entry, versions ×6, README §Security +
test-count refresh (3,568 across 205 files — also corrects the stale
3,541), §10 plain-language entry, landing banner, brief-stats (tests
3,568) and the regenerated trust brief with its in-app twin.

Gates before tagging: synthetic-controls + office controls PASS, score
ledger 283 verified with zero movement, resave invariance 108 held —
a web-only change, proven to have moved no score.
</commit_message>
<xml_diff>
--- a/docs/brief/checker-brief.docx
+++ b/docs/brief/checker-brief.docx
@@ -50,23 +50,23 @@
           <w:b/>
           <w:bCs/>
         </w:rPr>
-        <w:t xml:space="preserve">12,457</w:t>
-      </w:r>
-      <w:r>
-        <w:t xml:space="preserve"> </w:t>
-      </w:r>
-      <w:r>
-        <w:t xml:space="preserve">check-ups run for internal and external agencies — the quick per-file check-up that has caught on beyond ICJIA: easier than SiteImprove, clearer than PAC. 8,343 in the last 30 days alone. ·</w:t>
-      </w:r>
-      <w:r>
-        <w:t xml:space="preserve"> </w:t>
-      </w:r>
-      <w:r>
-        <w:rPr>
-          <w:b/>
-          <w:bCs/>
-        </w:rPr>
-        <w:t xml:space="preserve">3,531</w:t>
+        <w:t xml:space="preserve">12,468</w:t>
+      </w:r>
+      <w:r>
+        <w:t xml:space="preserve"> </w:t>
+      </w:r>
+      <w:r>
+        <w:t xml:space="preserve">check-ups run for internal and external agencies — the quick per-file check-up that has caught on beyond ICJIA: easier than SiteImprove, clearer than PAC. 8,354 in the last 30 days alone. ·</w:t>
+      </w:r>
+      <w:r>
+        <w:t xml:space="preserve"> </w:t>
+      </w:r>
+      <w:r>
+        <w:rPr>
+          <w:b/>
+          <w:bCs/>
+        </w:rPr>
+        <w:t xml:space="preserve">3,568</w:t>
       </w:r>
       <w:r>
         <w:t xml:space="preserve"> </w:t>
@@ -98,7 +98,7 @@
           <w:b/>
           <w:bCs/>
         </w:rPr>
-        <w:t xml:space="preserve">846</w:t>
+        <w:t xml:space="preserve">849</w:t>
       </w:r>
       <w:r>
         <w:t xml:space="preserve"> </w:t>
@@ -882,7 +882,7 @@
         <w:pStyle w:val="FirstParagraph"/>
       </w:pPr>
       <w:r>
-        <w:t xml:space="preserve">Twelve gates stand between a code change and the live site, run automatically on every change; one failure stops the release cold. On every change: the 3,531 self-checks (every promise ever made, re-tested); the 153 trap documents rebuilt and re-judged; the scoring invariant (the grade shown must always match the score computed); the</w:t>
+        <w:t xml:space="preserve">Twelve gates stand between a code change and the live site, run automatically on every change; one failure stops the release cold. On every change: the 3,568 self-checks (every promise ever made, re-tested); the 153 trap documents rebuilt and re-judged; the scoring invariant (the grade shown must always match the score computed); the</w:t>
       </w:r>
       <w:r>
         <w:t xml:space="preserve"> </w:t>
@@ -987,7 +987,7 @@
           <w:b/>
           <w:bCs/>
         </w:rPr>
-        <w:t xml:space="preserve">51 documents came back for a re-check after repairs — and 10 of them climbed all the way to an A</w:t>
+        <w:t xml:space="preserve">53 documents came back for a re-check after repairs — and 10 of them climbed all the way to an A</w:t>
       </w:r>
       <w:r>
         <w:t xml:space="preserve">: failed, fixed, and passed under the same rules. This is the question behind every other question, and the answer no sales pitch can fake: the same file, failed and then passed.</w:t>
@@ -1108,13 +1108,13 @@
       </w:r>
     </w:p>
     <w:bookmarkEnd w:id="17"/>
-    <w:bookmarkStart w:id="20" w:name="six-months.-846-changes.-153-versions."/>
+    <w:bookmarkStart w:id="20" w:name="six-months.-849-changes.-154-versions."/>
     <w:p>
       <w:pPr>
         <w:pStyle w:val="Heading2"/>
       </w:pPr>
       <w:r>
-        <w:t xml:space="preserve">Six months. 846 changes. 153 versions.</w:t>
+        <w:t xml:space="preserve">Six months. 849 changes. 154 versions.</w:t>
       </w:r>
     </w:p>
     <w:p>
@@ -1122,7 +1122,7 @@
         <w:pStyle w:val="FirstParagraph"/>
       </w:pPr>
       <w:r>
-        <w:t xml:space="preserve">Not a weekend project. Since March it has grown from a single PDF check into a checker for four kinds of files — 406 saved changes in the last 30 days alone, its battery of self-checks grown from about 1,500 in June to 3,531 today. All of it is public, on GitHub:</w:t>
+        <w:t xml:space="preserve">Not a weekend project. Since March it has grown from a single PDF check into a checker for four kinds of files — 409 saved changes in the last 30 days alone, its battery of self-checks grown from about 1,500 in June to 3,568 today. All of it is public, on GitHub:</w:t>
       </w:r>
       <w:r>
         <w:t xml:space="preserve"> </w:t>
@@ -1197,7 +1197,7 @@
         <w:t xml:space="preserve"> </w:t>
       </w:r>
       <w:r>
-        <w:t xml:space="preserve">This is real software, battle-tested: 12,457 check-ups for internal and external agencies, 153 trap documents designed to fool it, an independent referee co-signing every report, and a public record of every change — and it is free. Nothing here asks for trust; every claim here is checkable by anyone:</w:t>
+        <w:t xml:space="preserve">This is real software, battle-tested: 12,468 check-ups for internal and external agencies, 153 trap documents designed to fool it, an independent referee co-signing every report, and a public record of every change — and it is free. Nothing here asks for trust; every claim here is checkable by anyone:</w:t>
       </w:r>
     </w:p>
     <w:p>
@@ -1257,13 +1257,13 @@
           <w:b/>
           <w:bCs/>
         </w:rPr>
-        <w:t xml:space="preserve">3,531 self-checks.</w:t>
-      </w:r>
-      <w:r>
-        <w:t xml:space="preserve"> </w:t>
-      </w:r>
-      <w:r>
-        <w:t xml:space="preserve">Before anything new goes live, the software re-runs every promise it has ever made — all 3,531 must pass. A single failure stops the release cold: fix it, then run the full battery again from the top. A few of those promises, in plain words: a scanned page with no readable text must score zero (no partial credit for a picture of words); a file with no tables must never be graded on tables; the grade on screen and the grade in the downloaded report must match, digit for digit; an image description made of nothing but blank spaces must be caught as empty; a re-saved copy of a document must receive the identical grade, digit for digit; and all 153 trap documents must still be judged correctly, every release.</w:t>
+        <w:t xml:space="preserve">3,568 self-checks.</w:t>
+      </w:r>
+      <w:r>
+        <w:t xml:space="preserve"> </w:t>
+      </w:r>
+      <w:r>
+        <w:t xml:space="preserve">Before anything new goes live, the software re-runs every promise it has ever made — all 3,568 must pass. A single failure stops the release cold: fix it, then run the full battery again from the top. A few of those promises, in plain words: a scanned page with no readable text must score zero (no partial credit for a picture of words); a file with no tables must never be graded on tables; the grade on screen and the grade in the downloaded report must match, digit for digit; an image description made of nothing but blank spaces must be caught as empty; a re-saved copy of a document must receive the identical grade, digit for digit; and all 153 trap documents must still be judged correctly, every release.</w:t>
       </w:r>
     </w:p>
     <w:p>
@@ -1285,7 +1285,7 @@
         <w:t xml:space="preserve"> </w:t>
       </w:r>
       <w:r>
-        <w:t xml:space="preserve">153 version notes plus a plain-language security log written for records auditors — mistakes included.</w:t>
+        <w:t xml:space="preserve">154 version notes plus a plain-language security log written for records auditors — mistakes included.</w:t>
       </w:r>
     </w:p>
     <w:p>

</xml_diff>

<commit_message>
docs(trust): v1.155 timeline entry first — the timeline reads newest-first
</commit_message>
<xml_diff>
--- a/docs/brief/checker-brief.docx
+++ b/docs/brief/checker-brief.docx
@@ -98,7 +98,7 @@
           <w:b/>
           <w:bCs/>
         </w:rPr>
-        <w:t xml:space="preserve">850</w:t>
+        <w:t xml:space="preserve">851</w:t>
       </w:r>
       <w:r>
         <w:t xml:space="preserve"> </w:t>
@@ -1108,13 +1108,13 @@
       </w:r>
     </w:p>
     <w:bookmarkEnd w:id="17"/>
-    <w:bookmarkStart w:id="20" w:name="six-months.-850-changes.-155-versions."/>
+    <w:bookmarkStart w:id="20" w:name="six-months.-851-changes.-155-versions."/>
     <w:p>
       <w:pPr>
         <w:pStyle w:val="Heading2"/>
       </w:pPr>
       <w:r>
-        <w:t xml:space="preserve">Six months. 850 changes. 155 versions.</w:t>
+        <w:t xml:space="preserve">Six months. 851 changes. 155 versions.</w:t>
       </w:r>
     </w:p>
     <w:p>

</xml_diff>